<commit_message>
v2.0 prototype for cloud server
</commit_message>
<xml_diff>
--- a/output/word/第5章_系统实现.docx
+++ b/output/word/第5章_系统实现.docx
@@ -55,7 +55,7 @@
         <w:rPr>
           <w:rFonts w:ascii="Times New Roman" w:hAnsi="Times New Roman" w:eastAsia="宋体"/>
         </w:rPr>
-        <w:t>本章依据第四章给出的模块划分和数据设计，对ODS平台中的追溯与变更分析功能进行实现说明。系统延续前后端分离的模块化单体结构：React Web通过基于JavaScript对象表示法（JavaScript Object Notation，JSON）的表述性状态转移接口（Representational State Transfer，REST）调用Spring Boot服务；Spring Security使用JSON Web Token（JWT）完成身份识别和角色授权；Spring Data JPA负责对象持久化；正式数据库结构由Flyway脚本面向PostgreSQL管理，H2仅用于本地快速启动和自动化测试。模块化单体将相关功能保留在同一部署单元内，同时通过包和服务边界限制职责，适合当前小规模Demo的实现条件[1][2]。</w:t>
+        <w:t>本章依据第四章给出的模块划分和数据设计，对ODS平台中的追溯与变更分析功能进行实现说明。系统延续前后端分离的模块化单体结构：React Web通过基于JavaScript对象表示法（JavaScript Object Notation，JSON）的表述性状态转移接口（Representational State Transfer，REST）调用Spring Boot服务；Spring Security使用JSON Web Token（JWT）完成身份识别和角色授权；Spring Data JPA负责对象持久化；正式数据库结构由Flyway脚本面向PostgreSQL管理，H2仅用于本地快速启动和自动化测试。V4迁移进一步实现了刷新会话和密码恢复，Compose、Nginx、Prometheus与单节点K3s配置提供了小型企业原型的部署骨架，但容器运行尚未在本机完成验证。模块化单体将相关功能保留在同一部署单元内，同时通过包和服务边界限制职责，适合当前小规模Demo的实现条件[1][2]。</w:t>
       </w:r>
     </w:p>
     <w:p>
@@ -194,7 +194,7 @@
         <w:rPr>
           <w:rFonts w:ascii="Times New Roman" w:hAnsi="Times New Roman" w:eastAsia="宋体"/>
         </w:rPr>
-        <w:t>数据库采用双环境策略。PostgreSQL及Flyway迁移脚本代表正式结构基线，V1至V3脚本按顺序建立平台表和追溯表；H2关闭Flyway并由Hibernate创建或更新结构，仅承担开发启动与测试。H2运行成功只能证明应用逻辑在本地关系数据库上可执行，不能代替PostgreSQL方言、迁移顺序和容器部署验证。</w:t>
+        <w:t>数据库采用双环境策略。PostgreSQL及Flyway迁移脚本代表正式结构基线，V1至V4脚本按顺序建立平台、追溯和安全会话表；H2关闭Flyway并由Hibernate创建或更新结构，仅承担开发启动与测试。H2运行成功只能证明应用逻辑在本地关系数据库上可执行，不能代替PostgreSQL方言、迁移顺序和容器部署验证。</w:t>
       </w:r>
     </w:p>
     <w:p>
@@ -653,7 +653,7 @@
                 <w:rFonts w:ascii="Times New Roman" w:hAnsi="Times New Roman" w:eastAsia="宋体"/>
                 <w:sz w:val="20"/>
               </w:rPr>
-              <w:t>PostgreSQL 17目标镜像；Flyway V1-V3</w:t>
+              <w:t>PostgreSQL 17目标镜像；Flyway V1-V4</w:t>
             </w:r>
           </w:p>
         </w:tc>
@@ -907,6 +907,81 @@
           </w:p>
         </w:tc>
       </w:tr>
+      <w:tr>
+        <w:tc>
+          <w:tcPr>
+            <w:tcW w:type="dxa" w:w="1602"/>
+            <w:vAlign w:val="center"/>
+            <w:tcMar>
+              <w:top w:w="90" w:type="dxa"/>
+              <w:start w:w="120" w:type="dxa"/>
+              <w:bottom w:w="90" w:type="dxa"/>
+              <w:end w:w="120" w:type="dxa"/>
+            </w:tcMar>
+          </w:tcPr>
+          <w:p>
+            <w:pPr>
+              <w:spacing w:after="0"/>
+              <w:jc w:val="center"/>
+            </w:pPr>
+            <w:r>
+              <w:rPr>
+                <w:rFonts w:ascii="Times New Roman" w:hAnsi="Times New Roman" w:eastAsia="宋体"/>
+                <w:sz w:val="20"/>
+              </w:rPr>
+              <w:t>部署骨架</w:t>
+            </w:r>
+          </w:p>
+        </w:tc>
+        <w:tc>
+          <w:tcPr>
+            <w:tcW w:type="dxa" w:w="2848"/>
+            <w:vAlign w:val="center"/>
+            <w:tcMar>
+              <w:top w:w="90" w:type="dxa"/>
+              <w:start w:w="120" w:type="dxa"/>
+              <w:bottom w:w="90" w:type="dxa"/>
+              <w:end w:w="120" w:type="dxa"/>
+            </w:tcMar>
+          </w:tcPr>
+          <w:p>
+            <w:pPr>
+              <w:spacing w:after="0"/>
+            </w:pPr>
+            <w:r>
+              <w:rPr>
+                <w:rFonts w:ascii="Times New Roman" w:hAnsi="Times New Roman" w:eastAsia="宋体"/>
+                <w:sz w:val="20"/>
+              </w:rPr>
+              <w:t>Docker Compose；单节点K3s；GitHub Actions</w:t>
+            </w:r>
+          </w:p>
+        </w:tc>
+        <w:tc>
+          <w:tcPr>
+            <w:tcW w:type="dxa" w:w="4450"/>
+            <w:vAlign w:val="center"/>
+            <w:tcMar>
+              <w:top w:w="90" w:type="dxa"/>
+              <w:start w:w="120" w:type="dxa"/>
+              <w:bottom w:w="90" w:type="dxa"/>
+              <w:end w:w="120" w:type="dxa"/>
+            </w:tcMar>
+          </w:tcPr>
+          <w:p>
+            <w:pPr>
+              <w:spacing w:after="0"/>
+            </w:pPr>
+            <w:r>
+              <w:rPr>
+                <w:rFonts w:ascii="Times New Roman" w:hAnsi="Times New Roman" w:eastAsia="宋体"/>
+                <w:sz w:val="20"/>
+              </w:rPr>
+              <w:t>配置PostgreSQL、Redis、RabbitMQ、应用、探针和镜像流水线；仅完成静态解析</w:t>
+            </w:r>
+          </w:p>
+        </w:tc>
+      </w:tr>
     </w:tbl>
     <w:p/>
     <w:p>
@@ -980,7 +1055,7 @@
         <w:rPr>
           <w:rFonts w:ascii="Times New Roman" w:hAnsi="Times New Roman" w:eastAsia="宋体"/>
         </w:rPr>
-        <w:t>上述组件与项目、培训、市场和Workspace等既有模块运行在同一Spring Boot进程并共享事务管理器。当前追溯规模限定为不超过100个查询节点、关系量为数百条的Demo，模块化单体可以减少网络调用、分布式事务和独立运维成本[1]。因此，本实现没有引入微服务、消息队列或图数据库；该取舍只适用于本研究规模，不构成对其他架构的普遍结论。</w:t>
+        <w:t>上述组件与项目、培训、市场和Workspace等既有模块运行在同一Spring Boot进程并共享事务管理器。当前追溯规模限定为不超过100个查询节点、关系量为数百条的Demo，模块化单体可以减少网络调用、分布式事务和独立运维成本[1]。因此，本实现没有引入微服务或图数据库，也没有把RabbitMQ接入追溯业务路径；该取舍只适用于本研究规模，不构成对其他架构的普遍结论。</w:t>
       </w:r>
     </w:p>
     <w:p>
@@ -1868,6 +1943,231 @@
                 <w:rFonts w:ascii="Times New Roman" w:hAnsi="Times New Roman" w:eastAsia="宋体"/>
                 <w:sz w:val="20"/>
               </w:rPr>
+              <w:t>安全认证会话</w:t>
+            </w:r>
+          </w:p>
+        </w:tc>
+        <w:tc>
+          <w:tcPr>
+            <w:tcW w:type="dxa" w:w="1246"/>
+            <w:vAlign w:val="center"/>
+            <w:tcMar>
+              <w:top w:w="90" w:type="dxa"/>
+              <w:start w:w="120" w:type="dxa"/>
+              <w:bottom w:w="90" w:type="dxa"/>
+              <w:end w:w="120" w:type="dxa"/>
+            </w:tcMar>
+          </w:tcPr>
+          <w:p>
+            <w:pPr>
+              <w:spacing w:after="0"/>
+            </w:pPr>
+            <w:r>
+              <w:rPr>
+                <w:rFonts w:ascii="Times New Roman" w:hAnsi="Times New Roman" w:eastAsia="宋体"/>
+                <w:sz w:val="20"/>
+              </w:rPr>
+              <w:t>已实现</w:t>
+            </w:r>
+          </w:p>
+        </w:tc>
+        <w:tc>
+          <w:tcPr>
+            <w:tcW w:type="dxa" w:w="5162"/>
+            <w:vAlign w:val="center"/>
+            <w:tcMar>
+              <w:top w:w="90" w:type="dxa"/>
+              <w:start w:w="120" w:type="dxa"/>
+              <w:bottom w:w="90" w:type="dxa"/>
+              <w:end w:w="120" w:type="dxa"/>
+            </w:tcMar>
+          </w:tcPr>
+          <w:p>
+            <w:pPr>
+              <w:spacing w:after="0"/>
+            </w:pPr>
+            <w:r>
+              <w:rPr>
+                <w:rFonts w:ascii="Times New Roman" w:hAnsi="Times New Roman" w:eastAsia="宋体"/>
+                <w:sz w:val="20"/>
+              </w:rPr>
+              <w:t>15分钟访问令牌、8小时刷新令牌轮换、注销、锁定和密码恢复已实现并有集成测试</w:t>
+            </w:r>
+          </w:p>
+        </w:tc>
+      </w:tr>
+      <w:tr>
+        <w:tc>
+          <w:tcPr>
+            <w:tcW w:type="dxa" w:w="2492"/>
+            <w:vAlign w:val="center"/>
+            <w:tcMar>
+              <w:top w:w="90" w:type="dxa"/>
+              <w:start w:w="120" w:type="dxa"/>
+              <w:bottom w:w="90" w:type="dxa"/>
+              <w:end w:w="120" w:type="dxa"/>
+            </w:tcMar>
+          </w:tcPr>
+          <w:p>
+            <w:pPr>
+              <w:spacing w:after="0"/>
+              <w:jc w:val="center"/>
+            </w:pPr>
+            <w:r>
+              <w:rPr>
+                <w:rFonts w:ascii="Times New Roman" w:hAnsi="Times New Roman" w:eastAsia="宋体"/>
+                <w:sz w:val="20"/>
+              </w:rPr>
+              <w:t>角色迁移</w:t>
+            </w:r>
+          </w:p>
+        </w:tc>
+        <w:tc>
+          <w:tcPr>
+            <w:tcW w:type="dxa" w:w="1246"/>
+            <w:vAlign w:val="center"/>
+            <w:tcMar>
+              <w:top w:w="90" w:type="dxa"/>
+              <w:start w:w="120" w:type="dxa"/>
+              <w:bottom w:w="90" w:type="dxa"/>
+              <w:end w:w="120" w:type="dxa"/>
+            </w:tcMar>
+          </w:tcPr>
+          <w:p>
+            <w:pPr>
+              <w:spacing w:after="0"/>
+            </w:pPr>
+            <w:r>
+              <w:rPr>
+                <w:rFonts w:ascii="Times New Roman" w:hAnsi="Times New Roman" w:eastAsia="宋体"/>
+                <w:sz w:val="20"/>
+              </w:rPr>
+              <w:t>部分实现</w:t>
+            </w:r>
+          </w:p>
+        </w:tc>
+        <w:tc>
+          <w:tcPr>
+            <w:tcW w:type="dxa" w:w="5162"/>
+            <w:vAlign w:val="center"/>
+            <w:tcMar>
+              <w:top w:w="90" w:type="dxa"/>
+              <w:start w:w="120" w:type="dxa"/>
+              <w:bottom w:w="90" w:type="dxa"/>
+              <w:end w:w="120" w:type="dxa"/>
+            </w:tcMar>
+          </w:tcPr>
+          <w:p>
+            <w:pPr>
+              <w:spacing w:after="0"/>
+            </w:pPr>
+            <w:r>
+              <w:rPr>
+                <w:rFonts w:ascii="Times New Roman" w:hAnsi="Times New Roman" w:eastAsia="宋体"/>
+                <w:sz w:val="20"/>
+              </w:rPr>
+              <w:t>新增部门、项目、算法、硬件、测试、市场、培训、复核、采购和只读枚举；组织与数据范围闭环未完成</w:t>
+            </w:r>
+          </w:p>
+        </w:tc>
+      </w:tr>
+      <w:tr>
+        <w:tc>
+          <w:tcPr>
+            <w:tcW w:type="dxa" w:w="2492"/>
+            <w:vAlign w:val="center"/>
+            <w:tcMar>
+              <w:top w:w="90" w:type="dxa"/>
+              <w:start w:w="120" w:type="dxa"/>
+              <w:bottom w:w="90" w:type="dxa"/>
+              <w:end w:w="120" w:type="dxa"/>
+            </w:tcMar>
+          </w:tcPr>
+          <w:p>
+            <w:pPr>
+              <w:spacing w:after="0"/>
+              <w:jc w:val="center"/>
+            </w:pPr>
+            <w:r>
+              <w:rPr>
+                <w:rFonts w:ascii="Times New Roman" w:hAnsi="Times New Roman" w:eastAsia="宋体"/>
+                <w:sz w:val="20"/>
+              </w:rPr>
+              <w:t>部署骨架</w:t>
+            </w:r>
+          </w:p>
+        </w:tc>
+        <w:tc>
+          <w:tcPr>
+            <w:tcW w:type="dxa" w:w="1246"/>
+            <w:vAlign w:val="center"/>
+            <w:tcMar>
+              <w:top w:w="90" w:type="dxa"/>
+              <w:start w:w="120" w:type="dxa"/>
+              <w:bottom w:w="90" w:type="dxa"/>
+              <w:end w:w="120" w:type="dxa"/>
+            </w:tcMar>
+          </w:tcPr>
+          <w:p>
+            <w:pPr>
+              <w:spacing w:after="0"/>
+            </w:pPr>
+            <w:r>
+              <w:rPr>
+                <w:rFonts w:ascii="Times New Roman" w:hAnsi="Times New Roman" w:eastAsia="宋体"/>
+                <w:sz w:val="20"/>
+              </w:rPr>
+              <w:t>配置/静态验证</w:t>
+            </w:r>
+          </w:p>
+        </w:tc>
+        <w:tc>
+          <w:tcPr>
+            <w:tcW w:type="dxa" w:w="5162"/>
+            <w:vAlign w:val="center"/>
+            <w:tcMar>
+              <w:top w:w="90" w:type="dxa"/>
+              <w:start w:w="120" w:type="dxa"/>
+              <w:bottom w:w="90" w:type="dxa"/>
+              <w:end w:w="120" w:type="dxa"/>
+            </w:tcMar>
+          </w:tcPr>
+          <w:p>
+            <w:pPr>
+              <w:spacing w:after="0"/>
+            </w:pPr>
+            <w:r>
+              <w:rPr>
+                <w:rFonts w:ascii="Times New Roman" w:hAnsi="Times New Roman" w:eastAsia="宋体"/>
+                <w:sz w:val="20"/>
+              </w:rPr>
+              <w:t>Compose、Nginx、Prometheus、K3s和CI配置存在并通过静态解析；未实际启动</w:t>
+            </w:r>
+          </w:p>
+        </w:tc>
+      </w:tr>
+      <w:tr>
+        <w:tc>
+          <w:tcPr>
+            <w:tcW w:type="dxa" w:w="2492"/>
+            <w:vAlign w:val="center"/>
+            <w:tcMar>
+              <w:top w:w="90" w:type="dxa"/>
+              <w:start w:w="120" w:type="dxa"/>
+              <w:bottom w:w="90" w:type="dxa"/>
+              <w:end w:w="120" w:type="dxa"/>
+            </w:tcMar>
+          </w:tcPr>
+          <w:p>
+            <w:pPr>
+              <w:spacing w:after="0"/>
+              <w:jc w:val="center"/>
+            </w:pPr>
+            <w:r>
+              <w:rPr>
+                <w:rFonts w:ascii="Times New Roman" w:hAnsi="Times New Roman" w:eastAsia="宋体"/>
+                <w:sz w:val="20"/>
+              </w:rPr>
               <w:t>PostgreSQL与浏览器端验证</w:t>
             </w:r>
           </w:p>
@@ -1916,7 +2216,7 @@
                 <w:rFonts w:ascii="Times New Roman" w:hAnsi="Times New Roman" w:eastAsia="宋体"/>
                 <w:sz w:val="20"/>
               </w:rPr>
-              <w:t>本机无Docker，且无前端组件测试或浏览器E2E</w:t>
+              <w:t>本机无Docker和kubectl，且无前端组件测试或浏览器E2E</w:t>
             </w:r>
           </w:p>
         </w:tc>
@@ -1925,13 +2225,13 @@
     <w:p/>
     <w:p>
       <w:pPr>
-        <w:pStyle w:val="Heading2"/>
+        <w:pStyle w:val="Heading3"/>
       </w:pPr>
       <w:r>
         <w:rPr>
           <w:rFonts w:ascii="Times New Roman" w:hAnsi="Times New Roman" w:eastAsia="黑体"/>
         </w:rPr>
-        <w:t>5.2 数据库与领域对象实现</w:t>
+        <w:t>5.1.4 小型企业原型部署骨架</w:t>
       </w:r>
     </w:p>
     <w:p>
@@ -1949,7 +2249,7 @@
         <w:rPr>
           <w:rFonts w:ascii="Times New Roman" w:hAnsi="Times New Roman" w:eastAsia="宋体"/>
         </w:rPr>
-        <w:t>本节说明第四章的数据模型怎样落实为关系表和JPA实体。先解释迁移结构，再说明工件与版本，最后说明变更报告对象。表结构只列与逻辑理解有关的表和约束，不逐字段抄录SQL。建议增加由真实迁移脚本生成的ER图。</w:t>
+        <w:t>本小节解释配置文件能够证明什么，不能证明什么。第一段描述Compose中的服务和Nginx限流，第二段描述单节点K3s资源骨架与探针，第三段说明CI流水线和当前验证边界。这样安排可以把“具备部署配置”与“已经完成部署运行”区分开。建议插入一张拓扑图，但图中必须标注“配置骨架、未实测”。</w:t>
       </w:r>
     </w:p>
     <w:p>
@@ -1967,7 +2267,7 @@
         <w:rPr>
           <w:rFonts w:ascii="Times New Roman" w:hAnsi="Times New Roman" w:eastAsia="宋体"/>
         </w:rPr>
-        <w:t>请撰写“5.2 数据库与领域对象实现”。依据V3迁移中的13张追溯表、JPA实体和唯一约束，说明稳定工件、追加版本、有向关系、变更报告、解释路径、工单关联和日志的持久化。引用PostgreSQL与Flyway公开文档，强调H2不等价于PostgreSQL验证。</w:t>
+        <w:t>请撰写“5.1.4 小型企业原型部署骨架”。依据compose.yml、frontend/nginx.conf、application.yml、deploy/k8s和.github/workflows，说明PostgreSQL、Redis、RabbitMQ、后端和前端服务，登录与普通API限流，Prometheus指标、健康探针、单节点K3s资源限额、Secret、TLS Ingress、持久卷和CI构建。明确Docker、kubectl缺失，Compose/K3s未启动，Redis缓存与RabbitMQ业务消费者仍未实现。不要声称高可用或1000人实测。</w:t>
       </w:r>
     </w:p>
     <w:p>
@@ -1976,54 +2276,7 @@
         <w:rPr>
           <w:rFonts w:ascii="Times New Roman" w:hAnsi="Times New Roman" w:eastAsia="宋体"/>
         </w:rPr>
-        <w:t>追溯数据既包含相对稳定的工件身份，也包含随时间增加的版本、关系、变更和复核记录。已有研究指出，追溯信息需要同时保存来源、对象和关系上下文，才能支持后续查询和变化分析[9][10]。本实现采用关系模型保存节点和边，并通过外键、唯一键与事务约束维护一致性。PostgreSQL提供UUID、时间戳、数值和索引等基础能力[4]，Flyway按版本执行迁移以使Schema变化可追踪[5]。</w:t>
-      </w:r>
-    </w:p>
-    <w:p>
-      <w:pPr>
-        <w:pStyle w:val="Heading3"/>
-      </w:pPr>
-      <w:r>
-        <w:rPr>
-          <w:rFonts w:ascii="Times New Roman" w:hAnsi="Times New Roman" w:eastAsia="黑体"/>
-        </w:rPr>
-        <w:t>5.2.1 Flyway迁移与核心表</w:t>
-      </w:r>
-    </w:p>
-    <w:p>
-      <w:pPr>
-        <w:pStyle w:val="EditorialNote"/>
-      </w:pPr>
-      <w:r>
-        <w:rPr>
-          <w:rFonts w:ascii="Times New Roman" w:hAnsi="Times New Roman" w:eastAsia="宋体"/>
-          <w:b/>
-        </w:rPr>
-        <w:t>写作说明（定稿时删除）：</w:t>
-      </w:r>
-      <w:r>
-        <w:rPr>
-          <w:rFonts w:ascii="Times New Roman" w:hAnsi="Times New Roman" w:eastAsia="宋体"/>
-        </w:rPr>
-        <w:t>本小节先说明V3迁移的目的，再按身份、关系、分析和协同四组介绍13张表。表5.3避免逐字段展开，正文只解释关键外键、唯一键和索引为什么需要存在。PostgreSQL执行未验证这一事实应在结尾明确写出。</w:t>
-      </w:r>
-    </w:p>
-    <w:p>
-      <w:pPr>
-        <w:pStyle w:val="EditorialNote"/>
-      </w:pPr>
-      <w:r>
-        <w:rPr>
-          <w:rFonts w:ascii="Times New Roman" w:hAnsi="Times New Roman" w:eastAsia="宋体"/>
-          <w:b/>
-        </w:rPr>
-        <w:t>AI续写提示词（定稿时删除）：</w:t>
-      </w:r>
-      <w:r>
-        <w:rPr>
-          <w:rFonts w:ascii="Times New Roman" w:hAnsi="Times New Roman" w:eastAsia="宋体"/>
-        </w:rPr>
-        <w:t>请撰写“5.2.1 Flyway迁移与核心表”。说明V3__traceability_and_impact_analysis.sql建立13张表，按工件身份、关系、影响分析、工单与日志分组；解释uk_trace_artifact_source、uk_trace_artifact_version、uk_trace_relation、候选唯一键、路径步序号和索引。明确本机未执行PostgreSQL容器。</w:t>
+        <w:t>为便于从本地Demo过渡到小型企业原型，项目提供compose.yml和deploy/k8s目录。Compose声明PostgreSQL 17、Redis 7.4、RabbitMQ 4.1、Spring Boot后端和Nginx前端，并通过健康检查和依赖条件表达启动顺序。Nginx把登录接口设置为每分钟10次、突发5次，把普通API设置为每秒30次、突发60次，超过限制返回429。该配置用于减少明显的误操作和简单突发流量，不能替代完整的安全运营策略。</w:t>
       </w:r>
     </w:p>
     <w:p>
@@ -2032,7 +2285,7 @@
         <w:rPr>
           <w:rFonts w:ascii="Times New Roman" w:hAnsi="Times New Roman" w:eastAsia="宋体"/>
         </w:rPr>
-        <w:t>V3迁移在既有平台表之后增加13张追溯表。工件身份组保存工件类型、稳定工件和版本；关系组保存关系类型、可选端点规则和实际关系；分析组保存变更、报告、候选、路径及路径步骤；协同组保存候选与既有tickets表之间的关联以及操作日志。该分组使变化频率不同的数据分别持久化，同时用外键保持引用完整性。</w:t>
+        <w:t>K3s骨架面向单台2核4GB、60GB SSD的轻量节点，包含应用资源请求与上限、存活和就绪探针、Secret示例、TLS Ingress以及PostgreSQL、Redis和RabbitMQ持久卷。K3s是轻量Kubernetes发行版，但单节点配置不等于物理高可用，也没有证明故障转移、备份恢复或负载均衡性能[14]。application.yml开放健康、信息和Prometheus指标端点，并设置Hikari连接池；Prometheus端点用于暴露可采集指标，不代表监控服务器和告警规则已经部署[15]。Redis缓存策略、RabbitMQ可靠消息、重试和死信消费者尚未接入追溯业务。</w:t>
       </w:r>
     </w:p>
     <w:p>
@@ -2041,7 +2294,76 @@
         <w:rPr>
           <w:rFonts w:ascii="Times New Roman" w:hAnsi="Times New Roman" w:eastAsia="宋体"/>
         </w:rPr>
-        <w:t>唯一约束承担主要一致性职责。来源模块、来源对象类型和来源对象标识的三元组只能登记一次；同一工件下的版本标识不能重复；同一源版本、目标版本和关系类型只能存在一条关系；同一报告中的目标版本只能形成一个候选；同一路径中的步骤序号不能重复。源边、目标边、候选所属报告和日志时间均建立索引，以支持常用查询。</w:t>
+        <w:t>GitHub Actions中的CI流程执行Maven验证、前端安装与构建以及容器镜像构建，发布流程由人工触发并推送到GHCR。当前机器没有Docker和kubectl，因此Compose、K3s、PostgreSQL Testcontainers和镜像运行只完成静态配置检查，不能在本章写成端到端部署结果。边界文档把单节点原型目标限定为最高50名轻量并发用户，但当前没有完成负载测试；企业1000人在线只属于后续推荐架构目标。论文中的小型企业原型是推荐部署边界，实际系统仍以本地模块化单体Demo为主。</w:t>
+      </w:r>
+    </w:p>
+    <w:p>
+      <w:pPr>
+        <w:pStyle w:val="FigurePlaceholder"/>
+      </w:pPr>
+      <w:r>
+        <w:rPr>
+          <w:rFonts w:ascii="Times New Roman" w:hAnsi="Times New Roman" w:eastAsia="宋体"/>
+        </w:rPr>
+        <w:t>【这里需要增加部署拓扑图：浏览器经Nginx访问React前端，前端调用Spring Boot后端，后端连接PostgreSQL、Redis和RabbitMQ；用虚线标注K3s与Compose为配置骨架，并注明“当前机器未启动验证”】</w:t>
+      </w:r>
+    </w:p>
+    <w:p>
+      <w:pPr>
+        <w:pStyle w:val="Caption"/>
+      </w:pPr>
+      <w:r>
+        <w:rPr>
+          <w:rFonts w:ascii="Times New Roman" w:hAnsi="Times New Roman" w:eastAsia="宋体"/>
+        </w:rPr>
+        <w:t>图5.2 小型企业原型部署配置拓扑</w:t>
+      </w:r>
+    </w:p>
+    <w:p>
+      <w:pPr>
+        <w:pStyle w:val="Heading2"/>
+      </w:pPr>
+      <w:r>
+        <w:rPr>
+          <w:rFonts w:ascii="Times New Roman" w:hAnsi="Times New Roman" w:eastAsia="黑体"/>
+        </w:rPr>
+        <w:t>5.2 数据库与领域对象实现</w:t>
+      </w:r>
+    </w:p>
+    <w:p>
+      <w:pPr>
+        <w:pStyle w:val="EditorialNote"/>
+      </w:pPr>
+      <w:r>
+        <w:rPr>
+          <w:rFonts w:ascii="Times New Roman" w:hAnsi="Times New Roman" w:eastAsia="宋体"/>
+          <w:b/>
+        </w:rPr>
+        <w:t>写作说明（定稿时删除）：</w:t>
+      </w:r>
+      <w:r>
+        <w:rPr>
+          <w:rFonts w:ascii="Times New Roman" w:hAnsi="Times New Roman" w:eastAsia="宋体"/>
+        </w:rPr>
+        <w:t>本节说明第四章的数据模型怎样落实为关系表和JPA实体。先解释迁移结构，再说明工件与版本，最后说明变更报告对象。表结构只列与逻辑理解有关的表和约束，不逐字段抄录SQL。建议增加由真实迁移脚本生成的ER图。</w:t>
+      </w:r>
+    </w:p>
+    <w:p>
+      <w:pPr>
+        <w:pStyle w:val="EditorialNote"/>
+      </w:pPr>
+      <w:r>
+        <w:rPr>
+          <w:rFonts w:ascii="Times New Roman" w:hAnsi="Times New Roman" w:eastAsia="宋体"/>
+          <w:b/>
+        </w:rPr>
+        <w:t>AI续写提示词（定稿时删除）：</w:t>
+      </w:r>
+      <w:r>
+        <w:rPr>
+          <w:rFonts w:ascii="Times New Roman" w:hAnsi="Times New Roman" w:eastAsia="宋体"/>
+        </w:rPr>
+        <w:t>请撰写“5.2 数据库与领域对象实现”。依据V3迁移中的13张追溯表、V4安全迁移、JPA实体和唯一约束，说明稳定工件、追加版本、有向关系、变更报告、解释路径、工单关联、日志、刷新会话和密码恢复令牌的持久化。引用PostgreSQL与Flyway公开文档，强调H2不等价于PostgreSQL验证。</w:t>
       </w:r>
     </w:p>
     <w:p>
@@ -2050,7 +2372,90 @@
         <w:rPr>
           <w:rFonts w:ascii="Times New Roman" w:hAnsi="Times New Roman" w:eastAsia="宋体"/>
         </w:rPr>
+        <w:t>追溯数据既包含相对稳定的工件身份，也包含随时间增加的版本、关系、变更和复核记录。已有研究指出，追溯信息需要同时保存来源、对象和关系上下文，才能支持后续查询和变化分析[9][10]。本实现采用关系模型保存节点和边，并通过外键、唯一键与事务约束维护一致性。PostgreSQL提供UUID、时间戳、数值和索引等基础能力[4]，Flyway按版本执行迁移以使Schema变化可追踪[5]。</w:t>
+      </w:r>
+    </w:p>
+    <w:p>
+      <w:pPr>
+        <w:pStyle w:val="Heading3"/>
+      </w:pPr>
+      <w:r>
+        <w:rPr>
+          <w:rFonts w:ascii="Times New Roman" w:hAnsi="Times New Roman" w:eastAsia="黑体"/>
+        </w:rPr>
+        <w:t>5.2.1 Flyway迁移与核心表</w:t>
+      </w:r>
+    </w:p>
+    <w:p>
+      <w:pPr>
+        <w:pStyle w:val="EditorialNote"/>
+      </w:pPr>
+      <w:r>
+        <w:rPr>
+          <w:rFonts w:ascii="Times New Roman" w:hAnsi="Times New Roman" w:eastAsia="宋体"/>
+          <w:b/>
+        </w:rPr>
+        <w:t>写作说明（定稿时删除）：</w:t>
+      </w:r>
+      <w:r>
+        <w:rPr>
+          <w:rFonts w:ascii="Times New Roman" w:hAnsi="Times New Roman" w:eastAsia="宋体"/>
+        </w:rPr>
+        <w:t>本小节先说明V3迁移的目的，再按身份、关系、分析和协同四组介绍13张表，随后补充V4安全迁移的三类会话字段。表5.3避免逐字段展开，正文只解释关键外键、唯一键和索引为什么需要存在。PostgreSQL执行未验证这一事实应在结尾明确写出。</w:t>
+      </w:r>
+    </w:p>
+    <w:p>
+      <w:pPr>
+        <w:pStyle w:val="EditorialNote"/>
+      </w:pPr>
+      <w:r>
+        <w:rPr>
+          <w:rFonts w:ascii="Times New Roman" w:hAnsi="Times New Roman" w:eastAsia="宋体"/>
+          <w:b/>
+        </w:rPr>
+        <w:t>AI续写提示词（定稿时删除）：</w:t>
+      </w:r>
+      <w:r>
+        <w:rPr>
+          <w:rFonts w:ascii="Times New Roman" w:hAnsi="Times New Roman" w:eastAsia="宋体"/>
+        </w:rPr>
+        <w:t>请撰写“5.2.1 Flyway迁移与核心表”。说明V3__traceability_and_impact_analysis.sql建立13张追溯表，按工件身份、关系、影响分析、工单与日志分组；说明V4__secure_authentication_sessions.sql增加失败登录字段、refresh_tokens和password_reset_tokens；解释唯一键、路径步序号和索引。明确本机未执行PostgreSQL容器。</w:t>
+      </w:r>
+    </w:p>
+    <w:p>
+      <w:pPr/>
+      <w:r>
+        <w:rPr>
+          <w:rFonts w:ascii="Times New Roman" w:hAnsi="Times New Roman" w:eastAsia="宋体"/>
+        </w:rPr>
+        <w:t>V3迁移在既有平台表之后增加13张追溯表。工件身份组保存工件类型、稳定工件和版本；关系组保存关系类型、可选端点规则和实际关系；分析组保存变更、报告、候选、路径及路径步骤；协同组保存候选与既有tickets表之间的关联以及操作日志。该分组使变化频率不同的数据分别持久化，同时用外键保持引用完整性。</w:t>
+      </w:r>
+    </w:p>
+    <w:p>
+      <w:pPr/>
+      <w:r>
+        <w:rPr>
+          <w:rFonts w:ascii="Times New Roman" w:hAnsi="Times New Roman" w:eastAsia="宋体"/>
+        </w:rPr>
+        <w:t>唯一约束承担主要一致性职责。来源模块、来源对象类型和来源对象标识的三元组只能登记一次；同一工件下的版本标识不能重复；同一源版本、目标版本和关系类型只能存在一条关系；同一报告中的目标版本只能形成一个候选；同一路径中的步骤序号不能重复。源边、目标边、候选所属报告和日志时间均建立索引，以支持常用查询。</w:t>
+      </w:r>
+    </w:p>
+    <w:p>
+      <w:pPr/>
+      <w:r>
+        <w:rPr>
+          <w:rFonts w:ascii="Times New Roman" w:hAnsi="Times New Roman" w:eastAsia="宋体"/>
+        </w:rPr>
         <w:t>迁移脚本按PostgreSQL语法编写，并由Testcontainers测试预留实际兼容性检查。当前开发机器没有Docker，因此该测试在本轮执行中被自动跳过。V3脚本和测试类证明正式结构已经定义，但不能证明PostgreSQL 17容器已在本机成功迁移。</w:t>
+      </w:r>
+    </w:p>
+    <w:p>
+      <w:pPr/>
+      <w:r>
+        <w:rPr>
+          <w:rFonts w:ascii="Times New Roman" w:hAnsi="Times New Roman" w:eastAsia="宋体"/>
+        </w:rPr>
+        <w:t>V4迁移在users表增加failed_login_attempts和locked_until，用于连续失败锁定；refresh_tokens只保存令牌哈希、过期时间、撤销时间和轮换关系；password_reset_tokens保存一次性恢复令牌的哈希、过期时间和使用时间。V1至V4构成正式迁移链，但V4对应的PostgreSQL Testcontainers检查同样因本机没有Docker而未运行。</w:t>
       </w:r>
     </w:p>
     <w:p>
@@ -2559,7 +2964,7 @@
         <w:rPr>
           <w:rFonts w:ascii="Times New Roman" w:hAnsi="Times New Roman" w:eastAsia="宋体"/>
         </w:rPr>
-        <w:t>图5.2 追溯与变更分析核心数据实体关系</w:t>
+        <w:t>图5.3 追溯与变更分析核心数据实体关系</w:t>
       </w:r>
     </w:p>
     <w:p>
@@ -2655,7 +3060,7 @@
         <w:rPr>
           <w:rFonts w:ascii="Times New Roman" w:hAnsi="Times New Roman" w:eastAsia="宋体"/>
         </w:rPr>
-        <w:t>图5.3 工件登记与版本追加实现流程</w:t>
+        <w:t>图5.4 工件登记与版本追加实现流程</w:t>
       </w:r>
     </w:p>
     <w:p>
@@ -2955,7 +3360,7 @@
         <w:rPr>
           <w:rFonts w:ascii="Times New Roman" w:hAnsi="Times New Roman" w:eastAsia="宋体"/>
         </w:rPr>
-        <w:t>图5.4 工件关系创建与状态展示</w:t>
+        <w:t>图5.5 工件关系创建与状态展示</w:t>
       </w:r>
     </w:p>
     <w:p>
@@ -3255,7 +3660,7 @@
         <w:rPr>
           <w:rFonts w:ascii="Times New Roman" w:hAnsi="Times New Roman" w:eastAsia="宋体"/>
         </w:rPr>
-        <w:t>图5.5 有界正反向追溯查询流程</w:t>
+        <w:t>图5.6 有界正反向追溯查询流程</w:t>
       </w:r>
     </w:p>
     <w:p>
@@ -3351,7 +3756,7 @@
         <w:rPr>
           <w:rFonts w:ascii="Times New Roman" w:hAnsi="Times New Roman" w:eastAsia="宋体"/>
         </w:rPr>
-        <w:t>图5.6 有界追溯查询结果展示</w:t>
+        <w:t>图5.7 有界追溯查询结果展示</w:t>
       </w:r>
     </w:p>
     <w:p>
@@ -3662,7 +4067,7 @@
         <w:rPr>
           <w:rFonts w:ascii="Times New Roman" w:hAnsi="Times New Roman" w:eastAsia="宋体"/>
         </w:rPr>
-        <w:t>图5.7 可解释影响候选生成流程</w:t>
+        <w:t>图5.8 可解释影响候选生成流程</w:t>
       </w:r>
     </w:p>
     <w:p>
@@ -4399,7 +4804,7 @@
         <w:rPr>
           <w:rFonts w:ascii="Times New Roman" w:hAnsi="Times New Roman" w:eastAsia="宋体"/>
         </w:rPr>
-        <w:t>图5.8 人工复核与工单闭环实现时序</w:t>
+        <w:t>图5.9 人工复核与工单闭环实现时序</w:t>
       </w:r>
     </w:p>
     <w:p>
@@ -5353,7 +5758,7 @@
         <w:rPr>
           <w:rFonts w:ascii="Times New Roman" w:hAnsi="Times New Roman" w:eastAsia="宋体"/>
         </w:rPr>
-        <w:t>请撰写“5.7.2 JWT身份与角色授权”。引用RFC 7519和RBAC论文。说明登录后JWT随请求发送，Spring Security恢复身份，@PreAuthorize限制方法。读取需登录；维护角色较广；分析不含TRAINER/COORDINATOR；复核包含；建单限PJM/LPM/TRAINER/COORDINATOR/ADMIN；日志仅ADMIN。指出未实现来源级权限。</w:t>
+        <w:t>请撰写“5.7.2 JWT身份与角色授权”。引用RFC 7519和RBAC论文。说明登录后JWT随请求发送，Spring Security恢复身份，@PreAuthorize限制方法。更新角色为DEPARTMENT_HEAD、PROJECT_MANAGER、ALGORITHM_ENGINEER、HARDWARE_ENGINEER、TEST_ENGINEER、MARKET_SPECIALIST、TRAINING_SPECIALIST、REVIEWER、PROCUREMENT、READ_ONLY及旧角色兼容；说明维护、分析、复核、建单和日志的实际授权集合。指出组织、项目成员和来源对象级数据范围尚未形成闭环，READ_ONLY不是完整对象级策略。</w:t>
       </w:r>
     </w:p>
     <w:p>
@@ -5371,7 +5776,7 @@
         <w:rPr>
           <w:rFonts w:ascii="Times New Roman" w:hAnsi="Times New Roman" w:eastAsia="宋体"/>
         </w:rPr>
-        <w:t>类型、工件、关系、查询和报告读取面向已登录用户。工件版本和关系维护允许TPJM、PJM、EBE、EPO、LPM、TRAINER、COORDINATOR和ADMIN；变更创建与分析不包含TRAINER和COORDINATOR；候选复核允许PJM、EBE、EPO、LPM、TRAINER、COORDINATOR和ADMIN；工单确认进一步限制为PJM、LPM、TRAINER、COORDINATOR和ADMIN；操作日志只允许ADMIN。</w:t>
+        <w:t>Role枚举新增部门负责人（DEPARTMENT_HEAD）、项目经理（PROJECT_MANAGER）、算法工程师（ALGORITHM_ENGINEER）、硬件工程师（HARDWARE_ENGINEER）、测试工程师（TEST_ENGINEER）、市场专员（MARKET_SPECIALIST）、培训专员（TRAINING_SPECIALIST）、复核人（REVIEWER）、采购（PROCUREMENT）和只读角色（READ_ONLY），旧的TPJM、PJM、EBE、EPO、LPM、TRAINER、COORDINATOR和ADMIN仍保留兼容。追溯控制器已把新角色加入相应维护、分析、复核和建单接口，PMO控制器也允许PROJECT_MANAGER和DEPARTMENT_HEAD创建与维护PMO项目。</w:t>
       </w:r>
     </w:p>
     <w:p>
@@ -5380,54 +5785,7 @@
         <w:rPr>
           <w:rFonts w:ascii="Times New Roman" w:hAnsi="Times New Roman" w:eastAsia="宋体"/>
         </w:rPr>
-        <w:t>前端根据相同角色集合隐藏或显示操作按钮，但后端方法授权仍是最终检查。当前授权粒度停留在接口动作层，尚未根据来源模块和具体工件执行对象级可见性过滤，因此不能把该实现描述为完整的多租户或企业数据权限方案。</w:t>
-      </w:r>
-    </w:p>
-    <w:p>
-      <w:pPr>
-        <w:pStyle w:val="Heading3"/>
-      </w:pPr>
-      <w:r>
-        <w:rPr>
-          <w:rFonts w:ascii="Times New Roman" w:hAnsi="Times New Roman" w:eastAsia="黑体"/>
-        </w:rPr>
-        <w:t>5.7.3 参数校验与统一异常</w:t>
-      </w:r>
-    </w:p>
-    <w:p>
-      <w:pPr>
-        <w:pStyle w:val="EditorialNote"/>
-      </w:pPr>
-      <w:r>
-        <w:rPr>
-          <w:rFonts w:ascii="Times New Roman" w:hAnsi="Times New Roman" w:eastAsia="宋体"/>
-          <w:b/>
-        </w:rPr>
-        <w:t>写作说明（定稿时删除）：</w:t>
-      </w:r>
-      <w:r>
-        <w:rPr>
-          <w:rFonts w:ascii="Times New Roman" w:hAnsi="Times New Roman" w:eastAsia="宋体"/>
-        </w:rPr>
-        <w:t>本小节说明不同错误为何使用不同状态码。给出两三个与追溯相关的例子即可，不需要列出所有异常类。强调前端显示服务端message，但没有形成失败审计日志。</w:t>
-      </w:r>
-    </w:p>
-    <w:p>
-      <w:pPr>
-        <w:pStyle w:val="EditorialNote"/>
-      </w:pPr>
-      <w:r>
-        <w:rPr>
-          <w:rFonts w:ascii="Times New Roman" w:hAnsi="Times New Roman" w:eastAsia="宋体"/>
-          <w:b/>
-        </w:rPr>
-        <w:t>AI续写提示词（定稿时删除）：</w:t>
-      </w:r>
-      <w:r>
-        <w:rPr>
-          <w:rFonts w:ascii="Times New Roman" w:hAnsi="Times New Roman" w:eastAsia="宋体"/>
-        </w:rPr>
-        <w:t>请撰写“5.7.3 参数校验与统一异常”。说明Bean Validation处理必填和范围并返回400，未找到返回404，角色不足返回403，重复或版本冲突返回409，业务规则违反返回422。错误结构含code、message、fieldErrors、path和timestamp。举深度超限、自连接、重复关系和报告版本冲突例子。</w:t>
+        <w:t>类型、工件、关系、查询和报告读取要求登录。工件、版本与关系维护允许项目、工程、市场、培训、采购及旧兼容角色；变更创建与分析允许PROJECT_MANAGER、ALGORITHM_ENGINEER、HARDWARE_ENGINEER、TEST_ENGINEER、DEPARTMENT_HEAD及相应旧角色；候选复核允许PROJECT_MANAGER、REVIEWER、TRAINING_SPECIALIST及旧兼容角色；工单确认在项目经理、复核人、部门负责人、培训专员及旧角色中开放；操作日志仍仅ADMIN可读。</w:t>
       </w:r>
     </w:p>
     <w:p>
@@ -5436,7 +5794,54 @@
         <w:rPr>
           <w:rFonts w:ascii="Times New Roman" w:hAnsi="Times New Roman" w:eastAsia="宋体"/>
         </w:rPr>
-        <w:t>请求对象使用Bean Validation限制必填字段、字符串长度和数值范围。字段缺失或深度超限等格式问题返回400；资源不存在返回404；角色不足返回403；来源重复、有效关系重复或报告版本不一致返回409；自连接、停用未填写原因、未确认候选建单等业务规则错误返回422。</w:t>
+        <w:t>前端根据角色集合隐藏或显示操作按钮，但后端方法授权仍是最终检查。当前授权粒度停留在接口动作层，组织、部门、项目成员和数据范围尚未形成完整闭环，READ_ONLY也没有实现完整的对象级只读策略。因此不能把该实现描述为完成企业RBAC迁移、来源级权限、多租户隔离或企业数据权限方案。</w:t>
+      </w:r>
+    </w:p>
+    <w:p>
+      <w:pPr>
+        <w:pStyle w:val="Heading3"/>
+      </w:pPr>
+      <w:r>
+        <w:rPr>
+          <w:rFonts w:ascii="Times New Roman" w:hAnsi="Times New Roman" w:eastAsia="黑体"/>
+        </w:rPr>
+        <w:t>5.7.3 访问令牌、刷新会话与密码恢复</w:t>
+      </w:r>
+    </w:p>
+    <w:p>
+      <w:pPr>
+        <w:pStyle w:val="EditorialNote"/>
+      </w:pPr>
+      <w:r>
+        <w:rPr>
+          <w:rFonts w:ascii="Times New Roman" w:hAnsi="Times New Roman" w:eastAsia="宋体"/>
+          <w:b/>
+        </w:rPr>
+        <w:t>写作说明（定稿时删除）：</w:t>
+      </w:r>
+      <w:r>
+        <w:rPr>
+          <w:rFonts w:ascii="Times New Roman" w:hAnsi="Times New Roman" w:eastAsia="宋体"/>
+        </w:rPr>
+        <w:t>本小节解释登录后为何同时存在短期访问令牌和较长期刷新令牌，并把安全策略落到数据库字段和接口行为。先写令牌生命周期，再写轮换、注销和锁定，最后写密码恢复。建议配一张时序图，图中要标出旧刷新令牌失效；不要把关闭邮件通知写成已经发送邮件。</w:t>
+      </w:r>
+    </w:p>
+    <w:p>
+      <w:pPr>
+        <w:pStyle w:val="EditorialNote"/>
+      </w:pPr>
+      <w:r>
+        <w:rPr>
+          <w:rFonts w:ascii="Times New Roman" w:hAnsi="Times New Roman" w:eastAsia="宋体"/>
+          <w:b/>
+        </w:rPr>
+        <w:t>AI续写提示词（定稿时删除）：</w:t>
+      </w:r>
+      <w:r>
+        <w:rPr>
+          <w:rFonts w:ascii="Times New Roman" w:hAnsi="Times New Roman" w:eastAsia="宋体"/>
+        </w:rPr>
+        <w:t>请撰写“5.7.3 访问令牌、刷新会话与密码恢复”。依据AuthService、OpaqueTokenService、RefreshToken、PasswordResetToken、V4迁移和AuthenticationIntegrationTest，解释15分钟访问令牌、8小时刷新令牌、48字节随机不透明令牌、SHA-256哈希存储、刷新轮换、单会话/全部会话注销、连续5次失败锁定3分钟、15分钟一次性密码重置令牌、统一存在性提示和12位复杂密码规则。引用OWASP Authentication Cheat Sheet与RFC 9700。说明邮件发送由配置决定，当前默认关闭。</w:t>
       </w:r>
     </w:p>
     <w:p>
@@ -5445,54 +5850,7 @@
         <w:rPr>
           <w:rFonts w:ascii="Times New Roman" w:hAnsi="Times New Roman" w:eastAsia="宋体"/>
         </w:rPr>
-        <w:t>GlobalExceptionHandler把异常转换为code、message、fieldErrors、path和timestamp组成的统一结构。前端client.ts在响应失败时提取message并显示在通知栏，使用户能够区分输入错误、权限错误和并发冲突。当前异常路径没有统一写入业务操作日志，因此错误响应一致性已经实现，失败审计仍未完成。</w:t>
-      </w:r>
-    </w:p>
-    <w:p>
-      <w:pPr>
-        <w:pStyle w:val="Heading2"/>
-      </w:pPr>
-      <w:r>
-        <w:rPr>
-          <w:rFonts w:ascii="Times New Roman" w:hAnsi="Times New Roman" w:eastAsia="黑体"/>
-        </w:rPr>
-        <w:t>5.8 前端交互实现</w:t>
-      </w:r>
-    </w:p>
-    <w:p>
-      <w:pPr>
-        <w:pStyle w:val="EditorialNote"/>
-      </w:pPr>
-      <w:r>
-        <w:rPr>
-          <w:rFonts w:ascii="Times New Roman" w:hAnsi="Times New Roman" w:eastAsia="宋体"/>
-          <w:b/>
-        </w:rPr>
-        <w:t>写作说明（定稿时删除）：</w:t>
-      </w:r>
-      <w:r>
-        <w:rPr>
-          <w:rFonts w:ascii="Times New Roman" w:hAnsi="Times New Roman" w:eastAsia="宋体"/>
-        </w:rPr>
-        <w:t>本节只描述当前真实页面，不沿用第四章尚未实现的五工作区表述。先写路由和四标签，再写完整操作流程，最后列出缺口。建议使用实际截图替换占位符，截图必须来自构造数据。</w:t>
-      </w:r>
-    </w:p>
-    <w:p>
-      <w:pPr>
-        <w:pStyle w:val="EditorialNote"/>
-      </w:pPr>
-      <w:r>
-        <w:rPr>
-          <w:rFonts w:ascii="Times New Roman" w:hAnsi="Times New Roman" w:eastAsia="宋体"/>
-          <w:b/>
-        </w:rPr>
-        <w:t>AI续写提示词（定稿时删除）：</w:t>
-      </w:r>
-      <w:r>
-        <w:rPr>
-          <w:rFonts w:ascii="Times New Roman" w:hAnsi="Times New Roman" w:eastAsia="宋体"/>
-        </w:rPr>
-        <w:t>请撰写“5.8 前端交互实现”。依据TraceabilityPage.tsx，说明/traceability路由和artifacts、relations、query、impact四个标签；说明角色按钮、通知栏、表单、路径details、候选分值/等级/人工状态、window.prompt复核和window.confirm建单。指出缺失的前端功能。</w:t>
+        <w:t>访问令牌可以理解为一次请求的临时通行证，默认有效900秒；刷新令牌用于在访问令牌到期后换取新通行证，默认有效8小时。刷新令牌使用48字节随机不透明字符串，服务端数据库只保存其SHA-256哈希，不保存可直接使用的原文。短期访问令牌限制泄露后的可用时间，哈希保存降低数据库读取后的直接复用风险，这与OWASP关于会话和凭据保护的建议一致[12]。</w:t>
       </w:r>
     </w:p>
     <w:p>
@@ -5501,54 +5859,7 @@
         <w:rPr>
           <w:rFonts w:ascii="Times New Roman" w:hAnsi="Times New Roman" w:eastAsia="宋体"/>
         </w:rPr>
-        <w:t>前端将追溯功能集中在/traceability路由中，通过一个React组件完成数据加载与状态切换。页面首次加载时并行请求工件、关系和两类字典，并优先选择名称中包含TTC的版本作为默认查询与影响源。通知栏显示加载数量、查询耗时、候选数量或错误信息。</w:t>
-      </w:r>
-    </w:p>
-    <w:p>
-      <w:pPr>
-        <w:pStyle w:val="Heading3"/>
-      </w:pPr>
-      <w:r>
-        <w:rPr>
-          <w:rFonts w:ascii="Times New Roman" w:hAnsi="Times New Roman" w:eastAsia="黑体"/>
-        </w:rPr>
-        <w:t>5.8.1 四标签工作区与状态管理</w:t>
-      </w:r>
-    </w:p>
-    <w:p>
-      <w:pPr>
-        <w:pStyle w:val="EditorialNote"/>
-      </w:pPr>
-      <w:r>
-        <w:rPr>
-          <w:rFonts w:ascii="Times New Roman" w:hAnsi="Times New Roman" w:eastAsia="宋体"/>
-          <w:b/>
-        </w:rPr>
-        <w:t>写作说明（定稿时删除）：</w:t>
-      </w:r>
-      <w:r>
-        <w:rPr>
-          <w:rFonts w:ascii="Times New Roman" w:hAnsi="Times New Roman" w:eastAsia="宋体"/>
-        </w:rPr>
-        <w:t>本小节逐一说明四个标签的输入和输出。强调这是同一页面中的标签，不是四个或五个独立页面。说明useState和useMemo只需到职责层，不展开React教程。</w:t>
-      </w:r>
-    </w:p>
-    <w:p>
-      <w:pPr>
-        <w:pStyle w:val="EditorialNote"/>
-      </w:pPr>
-      <w:r>
-        <w:rPr>
-          <w:rFonts w:ascii="Times New Roman" w:hAnsi="Times New Roman" w:eastAsia="宋体"/>
-          <w:b/>
-        </w:rPr>
-        <w:t>AI续写提示词（定稿时删除）：</w:t>
-      </w:r>
-      <w:r>
-        <w:rPr>
-          <w:rFonts w:ascii="Times New Roman" w:hAnsi="Times New Roman" w:eastAsia="宋体"/>
-        </w:rPr>
-        <w:t>请撰写“5.8.1 四标签工作区与状态管理”。说明artifacts、relations、query和impact四个Tab。工件页登记TRACE_LOCAL V1并列表；关系页创建并列表；查询页选择起点、方向、深度；影响页输入变化、复核候选和建单。说明角色控制按钮可见性。</w:t>
+        <w:t>刷新操作在数据库写锁下读取当前哈希，确认未过期且未撤销后立即撤销旧令牌、保存替换令牌哈希并返回新的访问令牌和刷新令牌。旧令牌再次使用会失败，形成刷新令牌轮换机制[13]。/auth/sessions列出当前用户的有效会话，DELETE /auth/sessions/{id}可撤销指定会话，/auth/logout撤销当前刷新令牌，/auth/logout-all撤销当前用户的全部活动会话。前端client.ts共享一个refreshInFlight Promise，避免多个并发401响应同时刷新，刷新成功后只重试原受保护请求一次。</w:t>
       </w:r>
     </w:p>
     <w:p>
@@ -5557,7 +5868,76 @@
         <w:rPr>
           <w:rFonts w:ascii="Times New Roman" w:hAnsi="Times New Roman" w:eastAsia="宋体"/>
         </w:rPr>
-        <w:t>artifacts标签展示工件类型、来源、当前版本和状态，并为有维护权限的角色提供TRACE_LOCAL工件及V1版本登记表单。relations标签提供源版本、目标版本、关系类型和依据输入，并显示关系的箭头语义、传播模式与有效状态。query标签提供起点、正反方向和1至5级深度选择。impact标签提供变化类型、变化前后内容、说明和分析深度。</w:t>
+        <w:t>登录失败计数保存在用户记录中，连续5次失败后锁定3分钟；成功登录会清除失败计数。密码恢复请求不论邮箱是否存在都返回同一提示，避免通过响应内容枚举账号。恢复令牌有效15分钟并在确认后使未使用令牌失效，同时注销用户的刷新会话。新密码长度为12至255个字符，且必须同时包含大写字母、小写字母、数字和特殊字符。密码重置页面与接口已经实现，但实际邮件发送依赖PASSWORD_RESET_MAIL_ENABLED和SMTP配置，默认配置不启用邮件发送。</w:t>
+      </w:r>
+    </w:p>
+    <w:p>
+      <w:pPr>
+        <w:pStyle w:val="FigurePlaceholder"/>
+      </w:pPr>
+      <w:r>
+        <w:rPr>
+          <w:rFonts w:ascii="Times New Roman" w:hAnsi="Times New Roman" w:eastAsia="宋体"/>
+        </w:rPr>
+        <w:t>【这里需要增加认证时序图：登录失败计数与锁定、登录后访问令牌使用、刷新令牌轮换、旧令牌拒绝、单会话注销、全部会话注销和密码重置令牌一次性失效；图中区分客户端明文令牌与数据库哈希】</w:t>
+      </w:r>
+    </w:p>
+    <w:p>
+      <w:pPr>
+        <w:pStyle w:val="Caption"/>
+      </w:pPr>
+      <w:r>
+        <w:rPr>
+          <w:rFonts w:ascii="Times New Roman" w:hAnsi="Times New Roman" w:eastAsia="宋体"/>
+        </w:rPr>
+        <w:t>图5.10 会话刷新与密码恢复安全流程</w:t>
+      </w:r>
+    </w:p>
+    <w:p>
+      <w:pPr>
+        <w:pStyle w:val="Heading3"/>
+      </w:pPr>
+      <w:r>
+        <w:rPr>
+          <w:rFonts w:ascii="Times New Roman" w:hAnsi="Times New Roman" w:eastAsia="黑体"/>
+        </w:rPr>
+        <w:t>5.7.4 参数校验与统一异常</w:t>
+      </w:r>
+    </w:p>
+    <w:p>
+      <w:pPr>
+        <w:pStyle w:val="EditorialNote"/>
+      </w:pPr>
+      <w:r>
+        <w:rPr>
+          <w:rFonts w:ascii="Times New Roman" w:hAnsi="Times New Roman" w:eastAsia="宋体"/>
+          <w:b/>
+        </w:rPr>
+        <w:t>写作说明（定稿时删除）：</w:t>
+      </w:r>
+      <w:r>
+        <w:rPr>
+          <w:rFonts w:ascii="Times New Roman" w:hAnsi="Times New Roman" w:eastAsia="宋体"/>
+        </w:rPr>
+        <w:t>本小节说明不同错误为何使用不同状态码。给出两三个与追溯相关的例子即可，不需要列出所有异常类。强调前端显示服务端message，但没有形成失败审计日志。</w:t>
+      </w:r>
+    </w:p>
+    <w:p>
+      <w:pPr>
+        <w:pStyle w:val="EditorialNote"/>
+      </w:pPr>
+      <w:r>
+        <w:rPr>
+          <w:rFonts w:ascii="Times New Roman" w:hAnsi="Times New Roman" w:eastAsia="宋体"/>
+          <w:b/>
+        </w:rPr>
+        <w:t>AI续写提示词（定稿时删除）：</w:t>
+      </w:r>
+      <w:r>
+        <w:rPr>
+          <w:rFonts w:ascii="Times New Roman" w:hAnsi="Times New Roman" w:eastAsia="宋体"/>
+        </w:rPr>
+        <w:t>请撰写“5.7.4 参数校验与统一异常”。说明Bean Validation处理必填和范围并返回400，未找到返回404，角色不足返回403，重复或版本冲突返回409，业务规则违反返回422。错误结构含code、message、fieldErrors、path和timestamp。举深度超限、自连接、重复关系和报告版本冲突例子。</w:t>
       </w:r>
     </w:p>
     <w:p>
@@ -5566,7 +5946,7 @@
         <w:rPr>
           <w:rFonts w:ascii="Times New Roman" w:hAnsi="Times New Roman" w:eastAsia="宋体"/>
         </w:rPr>
-        <w:t>组件使用useState保存表单、加载、查询结果和当前报告，使用useMemo把工件版本转换为下拉选项并建立版本名称映射。维护、分析、复核和建单按钮分别根据登录用户角色显示；即使前端隐藏按钮，后端仍执行独立授权检查。</w:t>
+        <w:t>请求对象使用Bean Validation限制必填字段、字符串长度和数值范围。字段缺失或深度超限等格式问题返回400；资源不存在返回404；角色不足返回403；来源重复、有效关系重复或报告版本不一致返回409；自连接、停用未填写原因、未确认候选建单等业务规则错误返回422。</w:t>
       </w:r>
     </w:p>
     <w:p>
@@ -5575,18 +5955,18 @@
         <w:rPr>
           <w:rFonts w:ascii="Times New Roman" w:hAnsi="Times New Roman" w:eastAsia="宋体"/>
         </w:rPr>
-        <w:t>当前实现是一个页面中的四个标签，不是第四章设计的五个独立工作区。报告查看与复核合并在impact标签中，操作日志没有页面入口。论文中的界面数量应以当前实现为准。</w:t>
+        <w:t>GlobalExceptionHandler把异常转换为code、message、fieldErrors、path和timestamp组成的统一结构。前端client.ts在响应失败时提取message并显示在通知栏，使用户能够区分输入错误、权限错误和并发冲突。当前异常路径没有统一写入业务操作日志，因此错误响应一致性已经实现，失败审计仍未完成。</w:t>
       </w:r>
     </w:p>
     <w:p>
       <w:pPr>
-        <w:pStyle w:val="Heading3"/>
+        <w:pStyle w:val="Heading2"/>
       </w:pPr>
       <w:r>
         <w:rPr>
           <w:rFonts w:ascii="Times New Roman" w:hAnsi="Times New Roman" w:eastAsia="黑体"/>
         </w:rPr>
-        <w:t>5.8.2 查询、复核与建单交互</w:t>
+        <w:t>5.8 前端交互实现</w:t>
       </w:r>
     </w:p>
     <w:p>
@@ -5604,7 +5984,7 @@
         <w:rPr>
           <w:rFonts w:ascii="Times New Roman" w:hAnsi="Times New Roman" w:eastAsia="宋体"/>
         </w:rPr>
-        <w:t>本小节按用户动作顺序描述。截图应覆盖路径展开、系统初始分值和人工状态并列、截断提醒、二次确认。注意window.prompt和window.confirm是简单Demo交互，不写成复杂工作流引擎。</w:t>
+        <w:t>本节只描述当前真实页面，不沿用第四章尚未实现的五工作区表述。先写路由和四标签，再写完整操作流程，最后列出缺口。建议使用实际截图替换占位符，截图必须来自构造数据。</w:t>
       </w:r>
     </w:p>
     <w:p>
@@ -5622,7 +6002,7 @@
         <w:rPr>
           <w:rFonts w:ascii="Times New Roman" w:hAnsi="Times New Roman" w:eastAsia="宋体"/>
         </w:rPr>
-        <w:t>请撰写“5.8.2 查询、复核与建单交互”。说明查询结果显示节点卡片与可展开路径；影响表显示目标、initialScore、initialLevel、路径、reviewStatus和工单号；复核用prompt填写说明；建单前筛选CONFIRMED且无工单候选并用confirm二次确认；截断时显示警告。</w:t>
+        <w:t>请撰写“5.8 前端交互实现”。依据TraceabilityPage.tsx，说明/traceability路由和artifacts、relations、query、impact四个标签；说明角色按钮、通知栏、表单、路径details、候选分值/等级/人工状态、window.prompt复核和window.confirm建单。指出缺失的前端功能。</w:t>
       </w:r>
     </w:p>
     <w:p>
@@ -5631,7 +6011,54 @@
         <w:rPr>
           <w:rFonts w:ascii="Times New Roman" w:hAnsi="Times New Roman" w:eastAsia="宋体"/>
         </w:rPr>
-        <w:t>执行追溯后，页面显示节点卡片和按目标组织的可展开路径。路径步骤展示关系编码、遍历方向及源目标名称；达到深度或节点上限时，结果上方出现“可能被截断”提示。该展示以文本为主，尚未实现交互式关系图。</w:t>
+        <w:t>前端将追溯功能集中在/traceability路由中，通过一个React组件完成数据加载与状态切换。页面首次加载时并行请求工件、关系和两类字典，并优先选择名称中包含TTC的版本作为默认查询与影响源。通知栏显示加载数量、查询耗时、候选数量或错误信息。</w:t>
+      </w:r>
+    </w:p>
+    <w:p>
+      <w:pPr>
+        <w:pStyle w:val="Heading3"/>
+      </w:pPr>
+      <w:r>
+        <w:rPr>
+          <w:rFonts w:ascii="Times New Roman" w:hAnsi="Times New Roman" w:eastAsia="黑体"/>
+        </w:rPr>
+        <w:t>5.8.1 四标签工作区与状态管理</w:t>
+      </w:r>
+    </w:p>
+    <w:p>
+      <w:pPr>
+        <w:pStyle w:val="EditorialNote"/>
+      </w:pPr>
+      <w:r>
+        <w:rPr>
+          <w:rFonts w:ascii="Times New Roman" w:hAnsi="Times New Roman" w:eastAsia="宋体"/>
+          <w:b/>
+        </w:rPr>
+        <w:t>写作说明（定稿时删除）：</w:t>
+      </w:r>
+      <w:r>
+        <w:rPr>
+          <w:rFonts w:ascii="Times New Roman" w:hAnsi="Times New Roman" w:eastAsia="宋体"/>
+        </w:rPr>
+        <w:t>本小节逐一说明四个标签的输入和输出。强调这是同一页面中的标签，不是四个或五个独立页面。说明useState和useMemo只需到职责层，不展开React教程。</w:t>
+      </w:r>
+    </w:p>
+    <w:p>
+      <w:pPr>
+        <w:pStyle w:val="EditorialNote"/>
+      </w:pPr>
+      <w:r>
+        <w:rPr>
+          <w:rFonts w:ascii="Times New Roman" w:hAnsi="Times New Roman" w:eastAsia="宋体"/>
+          <w:b/>
+        </w:rPr>
+        <w:t>AI续写提示词（定稿时删除）：</w:t>
+      </w:r>
+      <w:r>
+        <w:rPr>
+          <w:rFonts w:ascii="Times New Roman" w:hAnsi="Times New Roman" w:eastAsia="宋体"/>
+        </w:rPr>
+        <w:t>请撰写“5.8.1 四标签工作区与状态管理”。说明artifacts、relations、query和impact四个Tab。工件页登记TRACE_LOCAL V1并列表；关系页创建并列表；查询页选择起点、方向、深度；影响页输入变化、复核候选和建单。说明角色控制按钮可见性。</w:t>
       </w:r>
     </w:p>
     <w:p>
@@ -5640,7 +6067,7 @@
         <w:rPr>
           <w:rFonts w:ascii="Times New Roman" w:hAnsi="Times New Roman" w:eastAsia="宋体"/>
         </w:rPr>
-        <w:t>执行影响分析后，候选表并列展示目标工件、初始等级、初始分值、主解释路径和人工状态。用户选择确认或排除时，页面通过简单输入框收集复核说明，并携带当前报告version提交。创建工单时，页面只选择已确认且尚无工单的候选，随后弹出二次确认对话框。</w:t>
+        <w:t>artifacts标签展示工件类型、来源、当前版本和状态，并为有维护权限的角色提供TRACE_LOCAL工件及V1版本登记表单。relations标签提供源版本、目标版本、关系类型和依据输入，并显示关系的箭头语义、传播模式与有效状态。query标签提供起点、正反方向和1至5级深度选择。impact标签提供变化类型、变化前后内容、说明和分析深度。</w:t>
       </w:r>
     </w:p>
     <w:p>
@@ -5649,76 +6076,7 @@
         <w:rPr>
           <w:rFonts w:ascii="Times New Roman" w:hAnsi="Times New Roman" w:eastAsia="宋体"/>
         </w:rPr>
-        <w:t>上述交互足以演示从分析到工单的闭环，但window.prompt和window.confirm只适合Demo。它们没有表单级校验、批量选择控制、负责人搜索或可访问性增强，不应写成已经成熟的企业工作流界面。</w:t>
-      </w:r>
-    </w:p>
-    <w:p>
-      <w:pPr>
-        <w:pStyle w:val="FigurePlaceholder"/>
-      </w:pPr>
-      <w:r>
-        <w:rPr>
-          <w:rFonts w:ascii="Times New Roman" w:hAnsi="Times New Roman" w:eastAsia="宋体"/>
-        </w:rPr>
-        <w:t>【这里需要增加影响分析标签实际截图，展示AEB构造变更输入、候选分值与等级、人工状态、可展开路径和已创建工单编号；必要时分成上下两张截图】</w:t>
-      </w:r>
-    </w:p>
-    <w:p>
-      <w:pPr>
-        <w:pStyle w:val="Caption"/>
-      </w:pPr>
-      <w:r>
-        <w:rPr>
-          <w:rFonts w:ascii="Times New Roman" w:hAnsi="Times New Roman" w:eastAsia="宋体"/>
-        </w:rPr>
-        <w:t>图5.9 影响候选、解释路径与人工复核界面</w:t>
-      </w:r>
-    </w:p>
-    <w:p>
-      <w:pPr>
-        <w:pStyle w:val="Heading3"/>
-      </w:pPr>
-      <w:r>
-        <w:rPr>
-          <w:rFonts w:ascii="Times New Roman" w:hAnsi="Times New Roman" w:eastAsia="黑体"/>
-        </w:rPr>
-        <w:t>5.8.3 前端未覆盖能力</w:t>
-      </w:r>
-    </w:p>
-    <w:p>
-      <w:pPr>
-        <w:pStyle w:val="EditorialNote"/>
-      </w:pPr>
-      <w:r>
-        <w:rPr>
-          <w:rFonts w:ascii="Times New Roman" w:hAnsi="Times New Roman" w:eastAsia="宋体"/>
-          <w:b/>
-        </w:rPr>
-        <w:t>写作说明（定稿时删除）：</w:t>
-      </w:r>
-      <w:r>
-        <w:rPr>
-          <w:rFonts w:ascii="Times New Roman" w:hAnsi="Times New Roman" w:eastAsia="宋体"/>
-        </w:rPr>
-        <w:t>本小节集中列出后端与前端差异，避免读者根据接口表误判页面完成度。按缺失操作、缺失视图和缺失测试三类写，结尾说明这不影响哪个最小演示闭环。</w:t>
-      </w:r>
-    </w:p>
-    <w:p>
-      <w:pPr>
-        <w:pStyle w:val="EditorialNote"/>
-      </w:pPr>
-      <w:r>
-        <w:rPr>
-          <w:rFonts w:ascii="Times New Roman" w:hAnsi="Times New Roman" w:eastAsia="宋体"/>
-          <w:b/>
-        </w:rPr>
-        <w:t>AI续写提示词（定稿时删除）：</w:t>
-      </w:r>
-      <w:r>
-        <w:rPr>
-          <w:rFonts w:ascii="Times New Roman" w:hAnsi="Times New Roman" w:eastAsia="宋体"/>
-        </w:rPr>
-        <w:t>请撰写“5.8.3 前端未覆盖能力”。明确前端未暴露版本追加、关系启停、报告历史、操作日志；未形成五独立工作区；没有来源受限展示、图形化拓扑、报告导出；没有组件测试或浏览器E2E。说明现有四标签仍能完成新建工件、建关系、查询、分析、复核和建单。</w:t>
+        <w:t>组件使用useState保存表单、加载、查询结果和当前报告，使用useMemo把工件版本转换为下拉选项并建立版本名称映射。维护、分析、复核和建单按钮分别根据登录用户角色显示；即使前端隐藏按钮，后端仍执行独立授权检查。</w:t>
       </w:r>
     </w:p>
     <w:p>
@@ -5727,7 +6085,54 @@
         <w:rPr>
           <w:rFonts w:ascii="Times New Roman" w:hAnsi="Times New Roman" w:eastAsia="宋体"/>
         </w:rPr>
-        <w:t>后端版本追加和关系状态修改接口尚未接入前端，用户只能通过API调用这些能力。报告列表与详情虽有接口，页面没有历史报告入口；管理员操作日志也没有导航或展示组件。来源受限节点、详情跳转、关系端点规则配置、报告导出和交互式拓扑图均未实现。</w:t>
+        <w:t>当前实现是一个页面中的四个标签，不是第四章设计的五个独立工作区。报告查看与复核合并在impact标签中，操作日志没有页面入口。论文中的界面数量应以当前实现为准。</w:t>
+      </w:r>
+    </w:p>
+    <w:p>
+      <w:pPr>
+        <w:pStyle w:val="Heading3"/>
+      </w:pPr>
+      <w:r>
+        <w:rPr>
+          <w:rFonts w:ascii="Times New Roman" w:hAnsi="Times New Roman" w:eastAsia="黑体"/>
+        </w:rPr>
+        <w:t>5.8.2 查询、复核与建单交互</w:t>
+      </w:r>
+    </w:p>
+    <w:p>
+      <w:pPr>
+        <w:pStyle w:val="EditorialNote"/>
+      </w:pPr>
+      <w:r>
+        <w:rPr>
+          <w:rFonts w:ascii="Times New Roman" w:hAnsi="Times New Roman" w:eastAsia="宋体"/>
+          <w:b/>
+        </w:rPr>
+        <w:t>写作说明（定稿时删除）：</w:t>
+      </w:r>
+      <w:r>
+        <w:rPr>
+          <w:rFonts w:ascii="Times New Roman" w:hAnsi="Times New Roman" w:eastAsia="宋体"/>
+        </w:rPr>
+        <w:t>本小节按用户动作顺序描述。截图应覆盖路径展开、系统初始分值和人工状态并列、截断提醒、二次确认。注意window.prompt和window.confirm是简单Demo交互，不写成复杂工作流引擎。</w:t>
+      </w:r>
+    </w:p>
+    <w:p>
+      <w:pPr>
+        <w:pStyle w:val="EditorialNote"/>
+      </w:pPr>
+      <w:r>
+        <w:rPr>
+          <w:rFonts w:ascii="Times New Roman" w:hAnsi="Times New Roman" w:eastAsia="宋体"/>
+          <w:b/>
+        </w:rPr>
+        <w:t>AI续写提示词（定稿时删除）：</w:t>
+      </w:r>
+      <w:r>
+        <w:rPr>
+          <w:rFonts w:ascii="Times New Roman" w:hAnsi="Times New Roman" w:eastAsia="宋体"/>
+        </w:rPr>
+        <w:t>请撰写“5.8.2 查询、复核与建单交互”。说明查询结果显示节点卡片与可展开路径；影响表显示目标、initialScore、initialLevel、路径、reviewStatus和工单号；复核用prompt填写说明；建单前筛选CONFIRMED且无工单候选并用confirm二次确认；截断时显示警告。</w:t>
       </w:r>
     </w:p>
     <w:p>
@@ -5736,54 +6141,7 @@
         <w:rPr>
           <w:rFonts w:ascii="Times New Roman" w:hAnsi="Times New Roman" w:eastAsia="宋体"/>
         </w:rPr>
-        <w:t>前端当前没有组件级自动测试，也没有使用浏览器自动化执行端到端测试。已有证据仅包括TypeScript类型检查、生产构建和H2环境下的API冒烟调用。尽管如此，四标签页面能够完成工件登记、关系创建、追溯查询、变更分析、逐项复核和确认建单这一最小演示流程。</w:t>
-      </w:r>
-    </w:p>
-    <w:p>
-      <w:pPr>
-        <w:pStyle w:val="Heading2"/>
-      </w:pPr>
-      <w:r>
-        <w:rPr>
-          <w:rFonts w:ascii="Times New Roman" w:hAnsi="Times New Roman" w:eastAsia="黑体"/>
-        </w:rPr>
-        <w:t>5.9 AEB构造数据与实际完成范围</w:t>
-      </w:r>
-    </w:p>
-    <w:p>
-      <w:pPr>
-        <w:pStyle w:val="EditorialNote"/>
-      </w:pPr>
-      <w:r>
-        <w:rPr>
-          <w:rFonts w:ascii="Times New Roman" w:hAnsi="Times New Roman" w:eastAsia="宋体"/>
-          <w:b/>
-        </w:rPr>
-        <w:t>写作说明（定稿时删除）：</w:t>
-      </w:r>
-      <w:r>
-        <w:rPr>
-          <w:rFonts w:ascii="Times New Roman" w:hAnsi="Times New Roman" w:eastAsia="宋体"/>
-        </w:rPr>
-        <w:t>本节把数据来源、验证证据和限制集中说明，是论文可信度的重要部分。先写种子数据如何构造，再列已获得的最小证据，最后逐项说明尚未完成内容。不要把构造数据称为仿真数据、实车数据或企业数据。</w:t>
-      </w:r>
-    </w:p>
-    <w:p>
-      <w:pPr>
-        <w:pStyle w:val="EditorialNote"/>
-      </w:pPr>
-      <w:r>
-        <w:rPr>
-          <w:rFonts w:ascii="Times New Roman" w:hAnsi="Times New Roman" w:eastAsia="宋体"/>
-          <w:b/>
-        </w:rPr>
-        <w:t>AI续写提示词（定稿时删除）：</w:t>
-      </w:r>
-      <w:r>
-        <w:rPr>
-          <w:rFonts w:ascii="Times New Roman" w:hAnsi="Times New Roman" w:eastAsia="宋体"/>
-        </w:rPr>
-        <w:t>请撰写“5.9 AEB构造数据与实际完成范围”。说明ods.seed.enabled控制固定种子，13类工件、8类关系、30个AEB工件和32条关系；覆盖TTC、雷达、摄像头、制动、算法、车型、测试、市场说明、课程、知识、指南、项目和工单。列出39/40后端测试、H2冒烟和前端构建证据，并如实写限制。</w:t>
+        <w:t>执行追溯后，页面显示节点卡片和按目标组织的可展开路径。路径步骤展示关系编码、遍历方向及源目标名称；达到深度或节点上限时，结果上方出现“可能被截断”提示。该展示以文本为主，尚未实现交互式关系图。</w:t>
       </w:r>
     </w:p>
     <w:p>
@@ -5792,54 +6150,7 @@
         <w:rPr>
           <w:rFonts w:ascii="Times New Roman" w:hAnsi="Times New Roman" w:eastAsia="宋体"/>
         </w:rPr>
-        <w:t>汽车软件同时连接需求、算法、硬件、验证和组织协作，相关软件工程研究也强调跨阶段一致性与可追踪的重要性[11]。本Demo数据的目的不是模拟真实自动驾驶性能，而是提供固定、可重复的跨域关系图。初始化器仅在ods.seed.enabled=true时运行，使测试或正式配置能够关闭演示数据。工件名称、参数值、关系权重和变化场景均由论文实现构造。</w:t>
-      </w:r>
-    </w:p>
-    <w:p>
-      <w:pPr>
-        <w:pStyle w:val="Heading3"/>
-      </w:pPr>
-      <w:r>
-        <w:rPr>
-          <w:rFonts w:ascii="Times New Roman" w:hAnsi="Times New Roman" w:eastAsia="黑体"/>
-        </w:rPr>
-        <w:t>5.9.1 固定种子数据构造</w:t>
-      </w:r>
-    </w:p>
-    <w:p>
-      <w:pPr>
-        <w:pStyle w:val="EditorialNote"/>
-      </w:pPr>
-      <w:r>
-        <w:rPr>
-          <w:rFonts w:ascii="Times New Roman" w:hAnsi="Times New Roman" w:eastAsia="宋体"/>
-          <w:b/>
-        </w:rPr>
-        <w:t>写作说明（定稿时删除）：</w:t>
-      </w:r>
-      <w:r>
-        <w:rPr>
-          <w:rFonts w:ascii="Times New Roman" w:hAnsi="Times New Roman" w:eastAsia="宋体"/>
-        </w:rPr>
-        <w:t>本小节说明数据规模、类别和跨域来源。正文要解释市场、培训和工单为什么不是无关模块：它们是变化后的说明、知识传递和执行闭环。明确历史销量只读、市场说明另建工件。</w:t>
-      </w:r>
-    </w:p>
-    <w:p>
-      <w:pPr>
-        <w:pStyle w:val="EditorialNote"/>
-      </w:pPr>
-      <w:r>
-        <w:rPr>
-          <w:rFonts w:ascii="Times New Roman" w:hAnsi="Times New Roman" w:eastAsia="宋体"/>
-          <w:b/>
-        </w:rPr>
-        <w:t>AI续写提示词（定稿时删除）：</w:t>
-      </w:r>
-      <w:r>
-        <w:rPr>
-          <w:rFonts w:ascii="Times New Roman" w:hAnsi="Times New Roman" w:eastAsia="宋体"/>
-        </w:rPr>
-        <w:t>请撰写“5.9.1 固定种子数据构造”。说明TraceabilityDataInitializer在开关开启时创建13类工件、8类关系、30个工件和32条关系。列举AEB目标、要求、TTC、减速度、雷达、摄像头、制动、融合/决策/控制算法、A1/B1配置、测试、市场说明、课程、知识、指南、项目和工单。强调数据为构造。</w:t>
+        <w:t>执行影响分析后，候选表并列展示目标工件、初始等级、初始分值、主解释路径和人工状态。用户选择确认或排除时，页面通过简单输入框收集复核说明，并携带当前报告version提交。创建工单时，页面只选择已确认且尚无工单的候选，随后弹出二次确认对话框。</w:t>
       </w:r>
     </w:p>
     <w:p>
@@ -5848,7 +6159,76 @@
         <w:rPr>
           <w:rFonts w:ascii="Times New Roman" w:hAnsi="Times New Roman" w:eastAsia="宋体"/>
         </w:rPr>
-        <w:t>TraceabilityDataInitializer建立13类工件和8类关系。八类关系分别为DECOMPOSES、CONSTRAINS、CONFIGURES、IMPLEMENTED_BY、VERIFIED_BY、DEPENDS_ON、DESCRIBED_BY和TRIGGERS_TASK，并为每类设置方向说明、传播模式和0.60至1.00之间的构造权重。</w:t>
+        <w:t>上述交互足以演示从分析到工单的闭环，但window.prompt和window.confirm只适合Demo。它们没有表单级校验、批量选择控制、负责人搜索或可访问性增强，不应写成已经成熟的企业工作流界面。</w:t>
+      </w:r>
+    </w:p>
+    <w:p>
+      <w:pPr>
+        <w:pStyle w:val="FigurePlaceholder"/>
+      </w:pPr>
+      <w:r>
+        <w:rPr>
+          <w:rFonts w:ascii="Times New Roman" w:hAnsi="Times New Roman" w:eastAsia="宋体"/>
+        </w:rPr>
+        <w:t>【这里需要增加影响分析标签实际截图，展示AEB构造变更输入、候选分值与等级、人工状态、可展开路径和已创建工单编号；必要时分成上下两张截图】</w:t>
+      </w:r>
+    </w:p>
+    <w:p>
+      <w:pPr>
+        <w:pStyle w:val="Caption"/>
+      </w:pPr>
+      <w:r>
+        <w:rPr>
+          <w:rFonts w:ascii="Times New Roman" w:hAnsi="Times New Roman" w:eastAsia="宋体"/>
+        </w:rPr>
+        <w:t>图5.11 影响候选、解释路径与人工复核界面</w:t>
+      </w:r>
+    </w:p>
+    <w:p>
+      <w:pPr>
+        <w:pStyle w:val="Heading3"/>
+      </w:pPr>
+      <w:r>
+        <w:rPr>
+          <w:rFonts w:ascii="Times New Roman" w:hAnsi="Times New Roman" w:eastAsia="黑体"/>
+        </w:rPr>
+        <w:t>5.8.3 会话自动刷新与密码重置页面</w:t>
+      </w:r>
+    </w:p>
+    <w:p>
+      <w:pPr>
+        <w:pStyle w:val="EditorialNote"/>
+      </w:pPr>
+      <w:r>
+        <w:rPr>
+          <w:rFonts w:ascii="Times New Roman" w:hAnsi="Times New Roman" w:eastAsia="宋体"/>
+          <w:b/>
+        </w:rPr>
+        <w:t>写作说明（定稿时删除）：</w:t>
+      </w:r>
+      <w:r>
+        <w:rPr>
+          <w:rFonts w:ascii="Times New Roman" w:hAnsi="Times New Roman" w:eastAsia="宋体"/>
+        </w:rPr>
+        <w:t>本小节说明前端如何配合后端安全会话，重点是请求失败后的恢复路径和用户可见的密码恢复入口。段落顺序为请求拦截、页面路由和安全边界。建议插入登录、忘记密码、重置密码和账号安全页面截图，但截图不得包含真实邮箱或令牌。</w:t>
+      </w:r>
+    </w:p>
+    <w:p>
+      <w:pPr>
+        <w:pStyle w:val="EditorialNote"/>
+      </w:pPr>
+      <w:r>
+        <w:rPr>
+          <w:rFonts w:ascii="Times New Roman" w:hAnsi="Times New Roman" w:eastAsia="宋体"/>
+          <w:b/>
+        </w:rPr>
+        <w:t>AI续写提示词（定稿时删除）：</w:t>
+      </w:r>
+      <w:r>
+        <w:rPr>
+          <w:rFonts w:ascii="Times New Roman" w:hAnsi="Times New Roman" w:eastAsia="宋体"/>
+        </w:rPr>
+        <w:t>请撰写“5.8.3 会话自动刷新与密码重置页面”。依据frontend/src/api/client.ts、ForgotPasswordPage.tsx、ResetPasswordPage.tsx、AccountSecurityPage.tsx和登录页，说明共享refreshInFlight、401后重试一次、/forgot-password、/reset-password和/account/security路由、会话列表、单会话注销、通用提示和密码复杂度校验。说明账号安全页的“注销其他会话”按钮实际调用/auth/logout-all并撤销全部刷新会话，包括当前会话。指出当前令牌保存在localStorage，前端实现是Demo级会话方案，不能写成最高安全架构。</w:t>
       </w:r>
     </w:p>
     <w:p>
@@ -5857,7 +6237,7 @@
         <w:rPr>
           <w:rFonts w:ascii="Times New Roman" w:hAnsi="Times New Roman" w:eastAsia="宋体"/>
         </w:rPr>
-        <w:t>初始化器生成30个AEB工件和32条关系，覆盖安全制动距离目标、AEB要求、TTC与减速度参数、雷达、摄像头、制动执行器、融合/决策/控制算法、A1/B1车型配置、边界/雷达/视场/延迟/制动/回归测试、市场说明、课程、知识、视频指南、项目和工单。部分课程、知识、视频和工单引用ODS既有种子对象，不存在时退回TRACE_LOCAL对象。</w:t>
+        <w:t>client.ts在受保护请求返回401时尝试刷新访问令牌，并通过共享的refreshInFlight Promise保证同一时刻只有一个刷新请求。刷新成功后更新本地会话并重试原请求一次；刷新失败则清理会话并回到登录流程。该机制覆盖页面并发请求中的常见过期场景，但没有实现跨标签页锁、设备风险识别或异常会话告警。</w:t>
       </w:r>
     </w:p>
     <w:p>
@@ -5866,76 +6246,7 @@
         <w:rPr>
           <w:rFonts w:ascii="Times New Roman" w:hAnsi="Times New Roman" w:eastAsia="宋体"/>
         </w:rPr>
-        <w:t>市场、培训和工单并非追溯之外的附属模块。技术变化可能要求更新车型能力说明、培训材料和处理任务，因此这些对象作为链上工件参与解释。历史销量记录表示已经发生的事实，只用于来源存在性引用且保持只读；可修改的市场口径由独立MARKET_CONTENT工件表达。所有数据均为固定论文构造数据，不包含真实企业或客户信息。</w:t>
-      </w:r>
-    </w:p>
-    <w:p>
-      <w:pPr>
-        <w:pStyle w:val="FigurePlaceholder"/>
-      </w:pPr>
-      <w:r>
-        <w:rPr>
-          <w:rFonts w:ascii="Times New Roman" w:hAnsi="Times New Roman" w:eastAsia="宋体"/>
-        </w:rPr>
-        <w:t>【这里需要增加AEB固定种子关系图，选取12至15个代表节点，至少包含TTC、雷达、决策/融合算法、测试、A1车型、市场说明、培训课程、指南和工单；图注明“论文构造数据”】</w:t>
-      </w:r>
-    </w:p>
-    <w:p>
-      <w:pPr>
-        <w:pStyle w:val="Caption"/>
-      </w:pPr>
-      <w:r>
-        <w:rPr>
-          <w:rFonts w:ascii="Times New Roman" w:hAnsi="Times New Roman" w:eastAsia="宋体"/>
-        </w:rPr>
-        <w:t>图5.10 AEB跨域构造工件与关系示例</w:t>
-      </w:r>
-    </w:p>
-    <w:p>
-      <w:pPr>
-        <w:pStyle w:val="Heading3"/>
-      </w:pPr>
-      <w:r>
-        <w:rPr>
-          <w:rFonts w:ascii="Times New Roman" w:hAnsi="Times New Roman" w:eastAsia="黑体"/>
-        </w:rPr>
-        <w:t>5.9.2 当前验证证据</w:t>
-      </w:r>
-    </w:p>
-    <w:p>
-      <w:pPr>
-        <w:pStyle w:val="EditorialNote"/>
-      </w:pPr>
-      <w:r>
-        <w:rPr>
-          <w:rFonts w:ascii="Times New Roman" w:hAnsi="Times New Roman" w:eastAsia="宋体"/>
-          <w:b/>
-        </w:rPr>
-        <w:t>写作说明（定稿时删除）：</w:t>
-      </w:r>
-      <w:r>
-        <w:rPr>
-          <w:rFonts w:ascii="Times New Roman" w:hAnsi="Times New Roman" w:eastAsia="宋体"/>
-        </w:rPr>
-        <w:t>本小节只回答“代码是否能运行到这些位置”，不完成第六章的实验论证。使用表格列命令、结果和能证明什么，同时写不能证明什么。测试数字必须与verification.md一致。</w:t>
-      </w:r>
-    </w:p>
-    <w:p>
-      <w:pPr>
-        <w:pStyle w:val="EditorialNote"/>
-      </w:pPr>
-      <w:r>
-        <w:rPr>
-          <w:rFonts w:ascii="Times New Roman" w:hAnsi="Times New Roman" w:eastAsia="宋体"/>
-          <w:b/>
-        </w:rPr>
-        <w:t>AI续写提示词（定稿时删除）：</w:t>
-      </w:r>
-      <w:r>
-        <w:rPr>
-          <w:rFonts w:ascii="Times New Roman" w:hAnsi="Times New Roman" w:eastAsia="宋体"/>
-        </w:rPr>
-        <w:t>请撰写“5.9.2 当前验证证据”。列出mvn test执行40项、39通过、1个PostgreSQL/Testcontainers测试因无Docker跳过；前端typecheck和build通过；H2启动、登录和API冒烟通过，返回30工件和8关系类型；集成测试验证四节点环、3候选、路径、分值保留和1张TRACE_IMPACT工单。详细评价留第六章。</w:t>
+        <w:t>登录页提供忘记密码入口，/forgot-password页面提交邮箱并显示统一结果提示，/reset-password页面读取链接中的令牌并提交新密码。/account/security页面列出当前有效会话并支持撤销指定会话。页面上的“注销其他会话”按钮当前直接调用/auth/logout-all，后端会撤销该账号的全部刷新会话，包括当前刷新会话；现有访问令牌在剩余15分钟内仍可能继续使用。该文案与接口语义尚未完全一致，论文按实际行为说明。后端对存在和不存在的邮箱返回相同信息，前端因此不展示账号是否存在。</w:t>
       </w:r>
     </w:p>
     <w:p>
@@ -5944,7 +6255,76 @@
         <w:rPr>
           <w:rFonts w:ascii="Times New Roman" w:hAnsi="Times New Roman" w:eastAsia="宋体"/>
         </w:rPr>
-        <w:t>当前验证记录提供三类实现证据。后端自动测试共执行40项，其中39项通过，PostgreSQL/Testcontainers用例因本机没有Docker而跳过；前端TypeScript检查和生产构建通过；H2环境完成应用启动、登录和主要API冒烟调用。管理员查询追溯接口返回30个AEB工件和8类关系定义。</w:t>
+        <w:t>当前前端会话令牌保存在localStorage，便于本地Demo刷新页面后继续使用，但这不是生产环境中抵抗脚本注入的最高安全方案。论文只描述已实现的会话自动刷新、会话管理和密码恢复页面，不把它们扩展为完整设备风险控制、单点登录或企业身份治理。</w:t>
+      </w:r>
+    </w:p>
+    <w:p>
+      <w:pPr>
+        <w:pStyle w:val="FigurePlaceholder"/>
+      </w:pPr>
+      <w:r>
+        <w:rPr>
+          <w:rFonts w:ascii="Times New Roman" w:hAnsi="Times New Roman" w:eastAsia="宋体"/>
+        </w:rPr>
+        <w:t>【这里需要增加前端认证页面截图：登录页的忘记密码入口、忘记密码页的统一提示、重置密码页的令牌输入、账号安全页的会话列表与注销按钮；使用虚构邮箱和脱敏令牌，并在图注说明“注销其他会话”当前实际撤销全部刷新会话】</w:t>
+      </w:r>
+    </w:p>
+    <w:p>
+      <w:pPr>
+        <w:pStyle w:val="Caption"/>
+      </w:pPr>
+      <w:r>
+        <w:rPr>
+          <w:rFonts w:ascii="Times New Roman" w:hAnsi="Times New Roman" w:eastAsia="宋体"/>
+        </w:rPr>
+        <w:t>图5.12 前端会话管理与密码重置页面</w:t>
+      </w:r>
+    </w:p>
+    <w:p>
+      <w:pPr>
+        <w:pStyle w:val="Heading3"/>
+      </w:pPr>
+      <w:r>
+        <w:rPr>
+          <w:rFonts w:ascii="Times New Roman" w:hAnsi="Times New Roman" w:eastAsia="黑体"/>
+        </w:rPr>
+        <w:t>5.8.4 前端未覆盖能力</w:t>
+      </w:r>
+    </w:p>
+    <w:p>
+      <w:pPr>
+        <w:pStyle w:val="EditorialNote"/>
+      </w:pPr>
+      <w:r>
+        <w:rPr>
+          <w:rFonts w:ascii="Times New Roman" w:hAnsi="Times New Roman" w:eastAsia="宋体"/>
+          <w:b/>
+        </w:rPr>
+        <w:t>写作说明（定稿时删除）：</w:t>
+      </w:r>
+      <w:r>
+        <w:rPr>
+          <w:rFonts w:ascii="Times New Roman" w:hAnsi="Times New Roman" w:eastAsia="宋体"/>
+        </w:rPr>
+        <w:t>本小节集中列出后端与前端差异，避免读者根据接口表误判页面完成度。按缺失操作、缺失视图和缺失测试三类写，结尾说明现有四标签仍能完成哪个最小演示闭环。</w:t>
+      </w:r>
+    </w:p>
+    <w:p>
+      <w:pPr>
+        <w:pStyle w:val="EditorialNote"/>
+      </w:pPr>
+      <w:r>
+        <w:rPr>
+          <w:rFonts w:ascii="Times New Roman" w:hAnsi="Times New Roman" w:eastAsia="宋体"/>
+          <w:b/>
+        </w:rPr>
+        <w:t>AI续写提示词（定稿时删除）：</w:t>
+      </w:r>
+      <w:r>
+        <w:rPr>
+          <w:rFonts w:ascii="Times New Roman" w:hAnsi="Times New Roman" w:eastAsia="宋体"/>
+        </w:rPr>
+        <w:t>请撰写“5.8.4 前端未覆盖能力”。明确前端未暴露版本追加、关系启停、报告历史、操作日志；未形成五独立工作区；没有来源受限展示、图形化拓扑、报告导出；没有组件测试或浏览器E2E。说明现有四标签仍能完成新建工件、建关系、查询、分析、复核和建单。</w:t>
       </w:r>
     </w:p>
     <w:p>
@@ -5953,7 +6333,233 @@
         <w:rPr>
           <w:rFonts w:ascii="Times New Roman" w:hAnsi="Times New Roman" w:eastAsia="宋体"/>
         </w:rPr>
-        <w:t>追溯集成测试在一个事务中构造四节点关系，其中包含三节点环。查询返回4个节点和3条到达路径；影响分析生成3个带路径候选；人工复核后初始分值保持不变；选择1个已确认候选后创建1张source为TRACE_IMPACT的工单并保存1条链接。上述结果证明最小后端闭环能够执行。</w:t>
+        <w:t>后端版本追加和关系状态修改接口尚未接入前端，用户只能通过API调用这些能力。报告列表与详情虽有接口，页面没有历史报告入口；管理员操作日志也没有导航或展示组件。来源受限节点、详情跳转、关系端点规则配置、报告导出和交互式拓扑图均未实现。</w:t>
+      </w:r>
+    </w:p>
+    <w:p>
+      <w:pPr/>
+      <w:r>
+        <w:rPr>
+          <w:rFonts w:ascii="Times New Roman" w:hAnsi="Times New Roman" w:eastAsia="宋体"/>
+        </w:rPr>
+        <w:t>前端当前没有组件级自动测试，也没有使用浏览器自动化执行端到端测试。已有证据仅包括TypeScript类型检查、生产构建和H2环境下的API冒烟调用。尽管如此，四标签页面能够完成工件登记、关系创建、追溯查询、变更分析、逐项复核和确认建单这一最小演示流程。</w:t>
+      </w:r>
+    </w:p>
+    <w:p>
+      <w:pPr>
+        <w:pStyle w:val="Heading2"/>
+      </w:pPr>
+      <w:r>
+        <w:rPr>
+          <w:rFonts w:ascii="Times New Roman" w:hAnsi="Times New Roman" w:eastAsia="黑体"/>
+        </w:rPr>
+        <w:t>5.9 AEB构造数据与实际完成范围</w:t>
+      </w:r>
+    </w:p>
+    <w:p>
+      <w:pPr>
+        <w:pStyle w:val="EditorialNote"/>
+      </w:pPr>
+      <w:r>
+        <w:rPr>
+          <w:rFonts w:ascii="Times New Roman" w:hAnsi="Times New Roman" w:eastAsia="宋体"/>
+          <w:b/>
+        </w:rPr>
+        <w:t>写作说明（定稿时删除）：</w:t>
+      </w:r>
+      <w:r>
+        <w:rPr>
+          <w:rFonts w:ascii="Times New Roman" w:hAnsi="Times New Roman" w:eastAsia="宋体"/>
+        </w:rPr>
+        <w:t>本节把数据来源、验证证据和限制集中说明，是论文可信度的重要部分。先写种子数据如何构造，再列已获得的最小证据，最后逐项说明尚未完成内容。不要把构造数据称为仿真数据、实车数据或企业数据。</w:t>
+      </w:r>
+    </w:p>
+    <w:p>
+      <w:pPr>
+        <w:pStyle w:val="EditorialNote"/>
+      </w:pPr>
+      <w:r>
+        <w:rPr>
+          <w:rFonts w:ascii="Times New Roman" w:hAnsi="Times New Roman" w:eastAsia="宋体"/>
+          <w:b/>
+        </w:rPr>
+        <w:t>AI续写提示词（定稿时删除）：</w:t>
+      </w:r>
+      <w:r>
+        <w:rPr>
+          <w:rFonts w:ascii="Times New Roman" w:hAnsi="Times New Roman" w:eastAsia="宋体"/>
+        </w:rPr>
+        <w:t>请撰写“5.9 AEB构造数据与实际完成范围”。说明ods.seed.enabled控制固定种子，13类工件、8类关系、30个AEB工件和32条关系；覆盖TTC、雷达、摄像头、制动、算法、车型、测试、市场说明、课程、知识、指南、项目和工单。列出45/44后端测试、认证与权限集成测试、H2冒烟、前端构建和13份YAML静态解析证据，并如实写限制。</w:t>
+      </w:r>
+    </w:p>
+    <w:p>
+      <w:pPr/>
+      <w:r>
+        <w:rPr>
+          <w:rFonts w:ascii="Times New Roman" w:hAnsi="Times New Roman" w:eastAsia="宋体"/>
+        </w:rPr>
+        <w:t>汽车软件同时连接需求、算法、硬件、验证和组织协作，相关软件工程研究也强调跨阶段一致性与可追踪的重要性[11]。本Demo数据的目的不是模拟真实自动驾驶性能，而是提供固定、可重复的跨域关系图。初始化器仅在ods.seed.enabled=true时运行，使测试或正式配置能够关闭演示数据。工件名称、参数值、关系权重和变化场景均由论文实现构造。</w:t>
+      </w:r>
+    </w:p>
+    <w:p>
+      <w:pPr>
+        <w:pStyle w:val="Heading3"/>
+      </w:pPr>
+      <w:r>
+        <w:rPr>
+          <w:rFonts w:ascii="Times New Roman" w:hAnsi="Times New Roman" w:eastAsia="黑体"/>
+        </w:rPr>
+        <w:t>5.9.1 固定种子数据构造</w:t>
+      </w:r>
+    </w:p>
+    <w:p>
+      <w:pPr>
+        <w:pStyle w:val="EditorialNote"/>
+      </w:pPr>
+      <w:r>
+        <w:rPr>
+          <w:rFonts w:ascii="Times New Roman" w:hAnsi="Times New Roman" w:eastAsia="宋体"/>
+          <w:b/>
+        </w:rPr>
+        <w:t>写作说明（定稿时删除）：</w:t>
+      </w:r>
+      <w:r>
+        <w:rPr>
+          <w:rFonts w:ascii="Times New Roman" w:hAnsi="Times New Roman" w:eastAsia="宋体"/>
+        </w:rPr>
+        <w:t>本小节说明数据规模、类别和跨域来源。正文要解释市场、培训和工单为什么不是无关模块：它们是变化后的说明、知识传递和执行闭环。明确历史销量只读、市场说明另建工件。</w:t>
+      </w:r>
+    </w:p>
+    <w:p>
+      <w:pPr>
+        <w:pStyle w:val="EditorialNote"/>
+      </w:pPr>
+      <w:r>
+        <w:rPr>
+          <w:rFonts w:ascii="Times New Roman" w:hAnsi="Times New Roman" w:eastAsia="宋体"/>
+          <w:b/>
+        </w:rPr>
+        <w:t>AI续写提示词（定稿时删除）：</w:t>
+      </w:r>
+      <w:r>
+        <w:rPr>
+          <w:rFonts w:ascii="Times New Roman" w:hAnsi="Times New Roman" w:eastAsia="宋体"/>
+        </w:rPr>
+        <w:t>请撰写“5.9.1 固定种子数据构造”。说明TraceabilityDataInitializer在开关开启时创建13类工件、8类关系、30个工件和32条关系。列举AEB目标、要求、TTC、减速度、雷达、摄像头、制动、融合/决策/控制算法、A1/B1配置、测试、市场说明、课程、知识、指南、项目和工单。强调数据为构造。</w:t>
+      </w:r>
+    </w:p>
+    <w:p>
+      <w:pPr/>
+      <w:r>
+        <w:rPr>
+          <w:rFonts w:ascii="Times New Roman" w:hAnsi="Times New Roman" w:eastAsia="宋体"/>
+        </w:rPr>
+        <w:t>TraceabilityDataInitializer建立13类工件和8类关系。八类关系分别为DECOMPOSES、CONSTRAINS、CONFIGURES、IMPLEMENTED_BY、VERIFIED_BY、DEPENDS_ON、DESCRIBED_BY和TRIGGERS_TASK，并为每类设置方向说明、传播模式和0.60至1.00之间的构造权重。</w:t>
+      </w:r>
+    </w:p>
+    <w:p>
+      <w:pPr/>
+      <w:r>
+        <w:rPr>
+          <w:rFonts w:ascii="Times New Roman" w:hAnsi="Times New Roman" w:eastAsia="宋体"/>
+        </w:rPr>
+        <w:t>初始化器生成30个AEB工件和32条关系，覆盖安全制动距离目标、AEB要求、TTC与减速度参数、雷达、摄像头、制动执行器、融合/决策/控制算法、A1/B1车型配置、边界/雷达/视场/延迟/制动/回归测试、市场说明、课程、知识、视频指南、项目和工单。部分课程、知识、视频和工单引用ODS既有种子对象，不存在时退回TRACE_LOCAL对象。</w:t>
+      </w:r>
+    </w:p>
+    <w:p>
+      <w:pPr/>
+      <w:r>
+        <w:rPr>
+          <w:rFonts w:ascii="Times New Roman" w:hAnsi="Times New Roman" w:eastAsia="宋体"/>
+        </w:rPr>
+        <w:t>市场、培训和工单并非追溯之外的附属模块。技术变化可能要求更新车型能力说明、培训材料和处理任务，因此这些对象作为链上工件参与解释。历史销量记录表示已经发生的事实，只用于来源存在性引用且保持只读；可修改的市场口径由独立MARKET_CONTENT工件表达。所有数据均为固定论文构造数据，不包含真实企业或客户信息。</w:t>
+      </w:r>
+    </w:p>
+    <w:p>
+      <w:pPr>
+        <w:pStyle w:val="FigurePlaceholder"/>
+      </w:pPr>
+      <w:r>
+        <w:rPr>
+          <w:rFonts w:ascii="Times New Roman" w:hAnsi="Times New Roman" w:eastAsia="宋体"/>
+        </w:rPr>
+        <w:t>【这里需要增加AEB固定种子关系图，选取12至15个代表节点，至少包含TTC、雷达、决策/融合算法、测试、A1车型、市场说明、培训课程、指南和工单；图注明“论文构造数据”】</w:t>
+      </w:r>
+    </w:p>
+    <w:p>
+      <w:pPr>
+        <w:pStyle w:val="Caption"/>
+      </w:pPr>
+      <w:r>
+        <w:rPr>
+          <w:rFonts w:ascii="Times New Roman" w:hAnsi="Times New Roman" w:eastAsia="宋体"/>
+        </w:rPr>
+        <w:t>图5.13 AEB跨域构造工件与关系示例</w:t>
+      </w:r>
+    </w:p>
+    <w:p>
+      <w:pPr>
+        <w:pStyle w:val="Heading3"/>
+      </w:pPr>
+      <w:r>
+        <w:rPr>
+          <w:rFonts w:ascii="Times New Roman" w:hAnsi="Times New Roman" w:eastAsia="黑体"/>
+        </w:rPr>
+        <w:t>5.9.2 当前验证证据</w:t>
+      </w:r>
+    </w:p>
+    <w:p>
+      <w:pPr>
+        <w:pStyle w:val="EditorialNote"/>
+      </w:pPr>
+      <w:r>
+        <w:rPr>
+          <w:rFonts w:ascii="Times New Roman" w:hAnsi="Times New Roman" w:eastAsia="宋体"/>
+          <w:b/>
+        </w:rPr>
+        <w:t>写作说明（定稿时删除）：</w:t>
+      </w:r>
+      <w:r>
+        <w:rPr>
+          <w:rFonts w:ascii="Times New Roman" w:hAnsi="Times New Roman" w:eastAsia="宋体"/>
+        </w:rPr>
+        <w:t>本小节只回答“代码是否能运行到这些位置”，不完成第六章的实验论证。使用表格列命令、结果和能证明什么，同时写不能证明什么。测试数字必须与verification.md一致。</w:t>
+      </w:r>
+    </w:p>
+    <w:p>
+      <w:pPr>
+        <w:pStyle w:val="EditorialNote"/>
+      </w:pPr>
+      <w:r>
+        <w:rPr>
+          <w:rFonts w:ascii="Times New Roman" w:hAnsi="Times New Roman" w:eastAsia="宋体"/>
+          <w:b/>
+        </w:rPr>
+        <w:t>AI续写提示词（定稿时删除）：</w:t>
+      </w:r>
+      <w:r>
+        <w:rPr>
+          <w:rFonts w:ascii="Times New Roman" w:hAnsi="Times New Roman" w:eastAsia="宋体"/>
+        </w:rPr>
+        <w:t>请撰写“5.9.2 当前验证证据”。列出mvn test执行45项、44通过、1个PostgreSQL/Testcontainers测试因无Docker跳过；前端typecheck和build通过，处理54个模块，JS约271.62 kB、CSS约30.03 kB；Compose、2份GitHub Actions和10份K3s配置共13份YAML静态解析通过；H2启动、登录和API冒烟通过，返回30工件和8关系类型；认证集成测试验证刷新轮换、会话注销、锁定和密码重置非枚举；授权测试验证PROJECT_MANAGER、DEPARTMENT_HEAD的PMO兼容；追溯集成测试验证四节点环、3候选、路径、分值保留和1张TRACE_IMPACT工单。详细评价留第六章。</w:t>
+      </w:r>
+    </w:p>
+    <w:p>
+      <w:pPr/>
+      <w:r>
+        <w:rPr>
+          <w:rFonts w:ascii="Times New Roman" w:hAnsi="Times New Roman" w:eastAsia="宋体"/>
+        </w:rPr>
+        <w:t>当前验证记录提供四类实现证据。后端自动测试共执行45项，其中44项通过，PostgreSQL/Testcontainers用例因本机没有Docker而跳过；前端TypeScript检查和生产构建通过，生产构建处理54个模块，JavaScript产物约271.62 kB，CSS产物约30.03 kB；Compose、两份GitHub Actions工作流和10份K3s配置共13份YAML通过静态解析；H2环境完成应用启动、登录和主要API冒烟调用。管理员查询追溯接口返回30个AEB工件和8类关系定义。</w:t>
+      </w:r>
+    </w:p>
+    <w:p>
+      <w:pPr/>
+      <w:r>
+        <w:rPr>
+          <w:rFonts w:ascii="Times New Roman" w:hAnsi="Times New Roman" w:eastAsia="宋体"/>
+        </w:rPr>
+        <w:t>认证集成测试验证访问令牌900秒、刷新令牌轮换和旧令牌失效、连续5次失败锁定、会话注销以及密码重置请求不泄露账号存在性；新增授权测试验证PROJECT_MANAGER和DEPARTMENT_HEAD能够按配置创建或维护PMO项目。追溯集成测试在一个事务中构造四节点关系，其中包含三节点环。查询返回4个节点和3条到达路径；影响分析生成3个带路径候选；人工复核后初始分值保持不变；选择1个已确认候选后创建1张source为TRACE_IMPACT的工单并保存1条链接。上述结果证明安全认证、角色兼容与最小追溯后端闭环能够执行。</w:t>
       </w:r>
     </w:p>
     <w:p>
@@ -6121,7 +6727,7 @@
                 <w:rFonts w:ascii="Times New Roman" w:hAnsi="Times New Roman" w:eastAsia="宋体"/>
                 <w:sz w:val="20"/>
               </w:rPr>
-              <w:t>40项执行，39项通过，1项因无Docker跳过</w:t>
+              <w:t>45项执行，44项通过，1项因无Docker跳过</w:t>
             </w:r>
           </w:p>
         </w:tc>
@@ -6172,6 +6778,81 @@
                 <w:rFonts w:ascii="Times New Roman" w:hAnsi="Times New Roman" w:eastAsia="宋体"/>
                 <w:sz w:val="20"/>
               </w:rPr>
+              <w:t>认证集成测试</w:t>
+            </w:r>
+          </w:p>
+        </w:tc>
+        <w:tc>
+          <w:tcPr>
+            <w:tcW w:type="dxa" w:w="3204"/>
+            <w:vAlign w:val="center"/>
+            <w:tcMar>
+              <w:top w:w="90" w:type="dxa"/>
+              <w:start w:w="120" w:type="dxa"/>
+              <w:bottom w:w="90" w:type="dxa"/>
+              <w:end w:w="120" w:type="dxa"/>
+            </w:tcMar>
+          </w:tcPr>
+          <w:p>
+            <w:pPr>
+              <w:spacing w:after="0"/>
+            </w:pPr>
+            <w:r>
+              <w:rPr>
+                <w:rFonts w:ascii="Times New Roman" w:hAnsi="Times New Roman" w:eastAsia="宋体"/>
+                <w:sz w:val="20"/>
+              </w:rPr>
+              <w:t>900秒访问令牌、刷新轮换、旧令牌失效、5次失败锁定、会话注销、密码重置非枚举</w:t>
+            </w:r>
+          </w:p>
+        </w:tc>
+        <w:tc>
+          <w:tcPr>
+            <w:tcW w:type="dxa" w:w="3827"/>
+            <w:vAlign w:val="center"/>
+            <w:tcMar>
+              <w:top w:w="90" w:type="dxa"/>
+              <w:start w:w="120" w:type="dxa"/>
+              <w:bottom w:w="90" w:type="dxa"/>
+              <w:end w:w="120" w:type="dxa"/>
+            </w:tcMar>
+          </w:tcPr>
+          <w:p>
+            <w:pPr>
+              <w:spacing w:after="0"/>
+            </w:pPr>
+            <w:r>
+              <w:rPr>
+                <w:rFonts w:ascii="Times New Roman" w:hAnsi="Times New Roman" w:eastAsia="宋体"/>
+                <w:sz w:val="20"/>
+              </w:rPr>
+              <w:t>安全会话关键分支可执行；不能证明邮件投递或生产安全审计</w:t>
+            </w:r>
+          </w:p>
+        </w:tc>
+      </w:tr>
+      <w:tr>
+        <w:tc>
+          <w:tcPr>
+            <w:tcW w:type="dxa" w:w="1869"/>
+            <w:vAlign w:val="center"/>
+            <w:tcMar>
+              <w:top w:w="90" w:type="dxa"/>
+              <w:start w:w="120" w:type="dxa"/>
+              <w:bottom w:w="90" w:type="dxa"/>
+              <w:end w:w="120" w:type="dxa"/>
+            </w:tcMar>
+          </w:tcPr>
+          <w:p>
+            <w:pPr>
+              <w:spacing w:after="0"/>
+              <w:jc w:val="center"/>
+            </w:pPr>
+            <w:r>
+              <w:rPr>
+                <w:rFonts w:ascii="Times New Roman" w:hAnsi="Times New Roman" w:eastAsia="宋体"/>
+                <w:sz w:val="20"/>
+              </w:rPr>
               <w:t>前端检查</w:t>
             </w:r>
           </w:p>
@@ -6196,7 +6877,7 @@
                 <w:rFonts w:ascii="Times New Roman" w:hAnsi="Times New Roman" w:eastAsia="宋体"/>
                 <w:sz w:val="20"/>
               </w:rPr>
-              <w:t>typecheck与生产build通过</w:t>
+              <w:t>typecheck与生产build通过；54模块；JS 271.62 kB；CSS 30.03 kB</w:t>
             </w:r>
           </w:p>
         </w:tc>
@@ -6221,6 +6902,81 @@
                 <w:sz w:val="20"/>
               </w:rPr>
               <w:t>类型与打包通过；不能证明页面交互正确</w:t>
+            </w:r>
+          </w:p>
+        </w:tc>
+      </w:tr>
+      <w:tr>
+        <w:tc>
+          <w:tcPr>
+            <w:tcW w:type="dxa" w:w="1869"/>
+            <w:vAlign w:val="center"/>
+            <w:tcMar>
+              <w:top w:w="90" w:type="dxa"/>
+              <w:start w:w="120" w:type="dxa"/>
+              <w:bottom w:w="90" w:type="dxa"/>
+              <w:end w:w="120" w:type="dxa"/>
+            </w:tcMar>
+          </w:tcPr>
+          <w:p>
+            <w:pPr>
+              <w:spacing w:after="0"/>
+              <w:jc w:val="center"/>
+            </w:pPr>
+            <w:r>
+              <w:rPr>
+                <w:rFonts w:ascii="Times New Roman" w:hAnsi="Times New Roman" w:eastAsia="宋体"/>
+                <w:sz w:val="20"/>
+              </w:rPr>
+              <w:t>配置静态解析</w:t>
+            </w:r>
+          </w:p>
+        </w:tc>
+        <w:tc>
+          <w:tcPr>
+            <w:tcW w:type="dxa" w:w="3204"/>
+            <w:vAlign w:val="center"/>
+            <w:tcMar>
+              <w:top w:w="90" w:type="dxa"/>
+              <w:start w:w="120" w:type="dxa"/>
+              <w:bottom w:w="90" w:type="dxa"/>
+              <w:end w:w="120" w:type="dxa"/>
+            </w:tcMar>
+          </w:tcPr>
+          <w:p>
+            <w:pPr>
+              <w:spacing w:after="0"/>
+            </w:pPr>
+            <w:r>
+              <w:rPr>
+                <w:rFonts w:ascii="Times New Roman" w:hAnsi="Times New Roman" w:eastAsia="宋体"/>
+                <w:sz w:val="20"/>
+              </w:rPr>
+              <w:t>Compose、2份GitHub Actions和10份K3s配置，共13份YAML通过</w:t>
+            </w:r>
+          </w:p>
+        </w:tc>
+        <w:tc>
+          <w:tcPr>
+            <w:tcW w:type="dxa" w:w="3827"/>
+            <w:vAlign w:val="center"/>
+            <w:tcMar>
+              <w:top w:w="90" w:type="dxa"/>
+              <w:start w:w="120" w:type="dxa"/>
+              <w:bottom w:w="90" w:type="dxa"/>
+              <w:end w:w="120" w:type="dxa"/>
+            </w:tcMar>
+          </w:tcPr>
+          <w:p>
+            <w:pPr>
+              <w:spacing w:after="0"/>
+            </w:pPr>
+            <w:r>
+              <w:rPr>
+                <w:rFonts w:ascii="Times New Roman" w:hAnsi="Times New Roman" w:eastAsia="宋体"/>
+                <w:sz w:val="20"/>
+              </w:rPr>
+              <w:t>部署配置语法可解析；不能证明容器或K3s运行</w:t>
             </w:r>
           </w:p>
         </w:tc>
@@ -6421,7 +7177,7 @@
         <w:rPr>
           <w:rFonts w:ascii="Times New Roman" w:hAnsi="Times New Roman" w:eastAsia="宋体"/>
         </w:rPr>
-        <w:t>请撰写“5.9.3 实现差异与论文表述限制”。完整列出：来源只查存在；细粒度可见性未实现；restricted恒0/false；端点规则未种子化；只存一条路径；前端四标签；缺少版本追加、关系启停、报告历史、日志页面；成功日志为主；PostgreSQL未运行；无前端/E2E；无企业部署和生产审计。</w:t>
+        <w:t>请撰写“5.9.3 实现差异与论文表述限制”。完整列出：来源只查存在；细粒度可见性未实现；restricted恒0/false；端点规则未种子化；只存一条路径；前端四标签；缺少版本追加、关系启停、报告历史、日志页面；成功日志为主；Redis/RabbitMQ业务接入、S3上传、OpenSearch、组织数据权限、审批、采购价格、全局搜索、报表、站内告警和企业HA未实现；PostgreSQL、Compose和K3s运行未验证；无前端/E2E和生产审计。</w:t>
       </w:r>
     </w:p>
     <w:p>
@@ -6448,7 +7204,7 @@
         <w:rPr>
           <w:rFonts w:ascii="Times New Roman" w:hAnsi="Times New Roman" w:eastAsia="宋体"/>
         </w:rPr>
-        <w:t>PostgreSQL/Flyway兼容测试因无Docker未实际运行，Compose全栈也未在本机启动。系统没有真实企业部署、真实客户数据、道路测试、生产审计、可用性承诺或安全改进证据。论文可以陈述“设计并实现本地Demo闭环”和“为后续扩展保留结构”，不得陈述“完成企业级平台”“提高AEB安全性”或“产生业务收益”。</w:t>
+        <w:t>PostgreSQL/Flyway兼容测试因无Docker未实际运行，Compose全栈和K3s也未在本机启动。Redis缓存业务接入、RabbitMQ可靠消息、S3文件与缩略图、OpenSearch、组织与数据范围授权、审批、采购价格、全局搜索、报表、站内告警和真实企业高可用仍属于后续开发。单节点原型最高50名轻量并发用户的目标尚未经过负载测试，企业1000人在线只属于推荐架构目标。系统没有真实企业部署、真实客户数据、道路测试、生产审计、可用性承诺或安全改进证据。论文可以陈述“设计并实现本地Demo闭环”和“提供小型企业部署配置骨架”，不得陈述“完成企业级平台”“实现高可用”“完成1000人实测”“提高AEB安全性”或“产生业务收益”。</w:t>
       </w:r>
     </w:p>
     <w:p>
@@ -6504,7 +7260,7 @@
         <w:rPr>
           <w:rFonts w:ascii="Times New Roman" w:hAnsi="Times New Roman" w:eastAsia="宋体"/>
         </w:rPr>
-        <w:t>本章在ODS模块化单体内实现了跨域工件追溯与变更分析的最小闭环。V3迁移建立13张追溯表，ArtifactService实现来源存在检查、稳定工件、追加版本、关系创建与状态管理；TraceQueryService使用深度和节点数受限的BFS完成正反向查询，并返回节点、边、主到达路径和截断标志；ImpactAnalysisService依据传播方向、关系权重、路径衰减和变化类型匹配生成候选，保存初始分值、等级和一条主解释路径。</w:t>
+        <w:t>本章在ODS模块化单体内实现了跨域工件追溯与变更分析的最小闭环，并补充了短期访问令牌、轮换刷新令牌、会话管理、失败锁定和密码恢复。V3迁移建立13张追溯表，V4迁移建立安全会话表；ArtifactService实现来源存在检查、稳定工件、追加版本、关系创建与状态管理；TraceQueryService使用深度和节点数受限的BFS完成正反向查询；ImpactAnalysisService依据传播方向、关系权重、路径衰减和变化类型匹配生成候选，保存初始分值、等级和一条主解释路径。</w:t>
       </w:r>
     </w:p>
     <w:p>
@@ -6513,7 +7269,7 @@
         <w:rPr>
           <w:rFonts w:ascii="Times New Roman" w:hAnsi="Times New Roman" w:eastAsia="宋体"/>
         </w:rPr>
-        <w:t>人工复核状态与系统初始结果分别保存，报告乐观锁防止旧版本覆盖，只有已确认候选在二次确认后才能创建TRACE_IMPACT工单，工单与候选在同一事务中关联。React前端通过四个标签提供工件登记、关系创建、追溯查询、影响分析、复核和建单操作。固定种子数据覆盖TTC、硬件、制动目标及市场、培训、知识、指南和工单等跨域对象。当前实现仍缺少来源级可见性、第二解释路径、部分前端入口、失败日志、PostgreSQL实测和浏览器自动化验证。第六章将在这些真实边界内，使用三类构造AEB变化开展小规模、可重复的功能与性能实验。</w:t>
+        <w:t>人工复核状态与系统初始结果分别保存，报告乐观锁防止旧版本覆盖，只有已确认候选在二次确认后才能创建TRACE_IMPACT工单，工单与候选在同一事务中关联。React前端通过四个追溯标签以及账号安全、忘记密码和重置密码页面提供最小操作闭环。Compose、K3s和CI文件构成小型企业部署骨架，但仅完成静态检查。固定种子数据覆盖TTC、硬件、制动目标及市场、培训、知识、指南和工单等跨域对象。当前实现仍缺少来源级可见性、第二解释路径、Redis/RabbitMQ业务接入、S3、搜索、审批、真实高可用、PostgreSQL实测和浏览器自动化验证。第六章将在这些真实边界内，使用三类构造AEB变化开展小规模、可重复的功能与性能实验。</w:t>
       </w:r>
     </w:p>
     <w:p>
@@ -6653,6 +7409,50 @@
           <w:rFonts w:ascii="Times New Roman" w:hAnsi="Times New Roman" w:eastAsia="宋体"/>
         </w:rPr>
         <w:t>[11] PRETSCHNER A, BROY M, KRUGER I H, et al. Software engineering for automotive systems: A roadmap[C]//Future of Software Engineering. Minneapolis: IEEE, 2007: 55-71. DOI:10.1109/FOSE.2007.22.</w:t>
+      </w:r>
+    </w:p>
+    <w:p>
+      <w:pPr>
+        <w:ind w:hanging="360" w:left="360"/>
+      </w:pPr>
+      <w:r>
+        <w:rPr>
+          <w:rFonts w:ascii="Times New Roman" w:hAnsi="Times New Roman" w:eastAsia="宋体"/>
+        </w:rPr>
+        <w:t>[12] OWASP Foundation. Authentication Cheat Sheet[EB/OL]. 2025. https://cheatsheetseries.owasp.org/cheatsheets/Authentication_Cheat_Sheet.html. Accessed 2026-08-06.</w:t>
+      </w:r>
+    </w:p>
+    <w:p>
+      <w:pPr>
+        <w:ind w:hanging="360" w:left="360"/>
+      </w:pPr>
+      <w:r>
+        <w:rPr>
+          <w:rFonts w:ascii="Times New Roman" w:hAnsi="Times New Roman" w:eastAsia="宋体"/>
+        </w:rPr>
+        <w:t>[13] FETT D, CAMPBELL B, BRADLEY J, et al. OAuth 2.0 Security Best Current Practice: RFC 9700[S]. Internet Engineering Task Force, 2025. DOI:10.17487/RFC9700.</w:t>
+      </w:r>
+    </w:p>
+    <w:p>
+      <w:pPr>
+        <w:ind w:hanging="360" w:left="360"/>
+      </w:pPr>
+      <w:r>
+        <w:rPr>
+          <w:rFonts w:ascii="Times New Roman" w:hAnsi="Times New Roman" w:eastAsia="宋体"/>
+        </w:rPr>
+        <w:t>[14] K3s Authors. K3s Documentation[EB/OL]. 2026. https://docs.k3s.io/. Accessed 2026-08-06.</w:t>
+      </w:r>
+    </w:p>
+    <w:p>
+      <w:pPr>
+        <w:ind w:hanging="360" w:left="360"/>
+      </w:pPr>
+      <w:r>
+        <w:rPr>
+          <w:rFonts w:ascii="Times New Roman" w:hAnsi="Times New Roman" w:eastAsia="宋体"/>
+        </w:rPr>
+        <w:t>[15] Prometheus Authors. Prometheus Documentation[EB/OL]. 2026. https://prometheus.io/docs/. Accessed 2026-08-06.</w:t>
       </w:r>
     </w:p>
     <w:sectPr>

</xml_diff>